<commit_message>
Update the user manual and lab guide for lab validation
User manual (edition 2, 76 pages):
- New chapter 11, Atomic Red Team and lab validation: the test page,
  rule matches, recording a run for many rules, results and statuses,
  the rule page section, what to check when a rule does not fire, the
  Splunk export and updating the tests
- Getting started: user menu and Sign out, login lockout limits
- Rules: validation badge; ATT&CK: "Proven in lab only" and the tests of
  a technique; administration: password rules, sessions ending on a
  password change, new Data Health checks; FAQ entries
- Later chapters renumbered; 9 new screenshots, added to capture.cjs

Lab setup guide: loading the exported rules into the lab Splunk,
recording results in DetectKB, and the updated hand-over checklist.

Co-Authored-By: Claude Opus 5.5 <noreply@anthropic.com>
Claude-Session: https://claude.ai/code/session_01TPduT3MtVtvZmw19x4eKbq
</commit_message>
<xml_diff>
--- a/docs/lab-setup/DetectKB-Lab-Setup.docx
+++ b/docs/lab-setup/DetectKB-Lab-Setup.docx
@@ -79,7 +79,7 @@
           <w:szCs w:val="22"/>
           <w:rtl/>
         </w:rPr>
-        <w:t xml:space="preserve">ویرایش ۱ · مهر ۱۴۰۵</w:t>
+        <w:t xml:space="preserve">ویرایش ۲ · مهر ۱۴۰۵</w:t>
       </w:r>
     </w:p>
     <w:p>
@@ -218,7 +218,7 @@
           <w:szCs w:val="23"/>
           <w:rtl/>
         </w:rPr>
-        <w:t xml:space="preserve">    راه‌اندازی SPLUNK-LAB</w:t>
+        <w:t xml:space="preserve">    راه‌اندازی SPLUNK-LAB و بارگذاری قانون‌ها</w:t>
       </w:r>
     </w:p>
     <w:p>
@@ -5686,8 +5686,7 @@
     </w:p>
     <w:p>
       <w:pPr>
-        <w:pStyle w:val="Heading1"/>
-        <w:pageBreakBefore/>
+        <w:pStyle w:val="Heading2"/>
         <w:bidi/>
       </w:pPr>
       <w:r>
@@ -5695,7 +5694,7 @@
           <w:rFonts w:ascii="Segoe UI" w:cs="Tahoma" w:eastAsia="Segoe UI" w:hAnsi="Segoe UI"/>
           <w:rtl/>
         </w:rPr>
-        <w:t xml:space="preserve">۵. راه‌اندازی WIN-VICTIM</w:t>
+        <w:t xml:space="preserve">۴-۵. بارگذاری قانون‌ها از DetectKB</w:t>
       </w:r>
     </w:p>
     <w:p>
@@ -5709,7 +5708,7 @@
           <w:rFonts w:ascii="Segoe UI" w:cs="Tahoma" w:eastAsia="Segoe UI" w:hAnsi="Segoe UI"/>
           <w:rtl/>
         </w:rPr>
-        <w:t xml:space="preserve">این مراحل را روی WIN-VICTIM (و بعداً DC-LAB) با PowerShell در حالت </w:t>
+        <w:t xml:space="preserve">قانون‌ها باید در Splunk لب تعریف شوند تا هنگام تست هشدار بدهند. در DetectKB، صفحه‌ی </w:t>
       </w:r>
       <w:r>
         <w:rPr>
@@ -5718,41 +5717,14 @@
           <w:bCs/>
           <w:rtl w:val="false"/>
         </w:rPr>
-        <w:t xml:space="preserve">Administrator</w:t>
-      </w:r>
-      <w:r>
-        <w:rPr>
-          <w:rFonts w:ascii="Segoe UI" w:cs="Tahoma" w:eastAsia="Segoe UI" w:hAnsi="Segoe UI"/>
-          <w:rtl/>
-        </w:rPr>
-        <w:t xml:space="preserve"> اجرا کنید.</w:t>
-      </w:r>
-    </w:p>
-    <w:p>
-      <w:pPr>
-        <w:pStyle w:val="Heading2"/>
-        <w:bidi/>
-      </w:pPr>
-      <w:r>
-        <w:rPr>
-          <w:rFonts w:ascii="Segoe UI" w:cs="Tahoma" w:eastAsia="Segoe UI" w:hAnsi="Segoe UI"/>
-          <w:rtl/>
-        </w:rPr>
-        <w:t xml:space="preserve">۵-۱. Sysmon</w:t>
-      </w:r>
-    </w:p>
-    <w:p>
-      <w:pPr>
-        <w:bidi/>
-        <w:spacing w:after="120"/>
-        <w:jc w:val="both"/>
-      </w:pPr>
-      <w:r>
-        <w:rPr>
-          <w:rFonts w:ascii="Segoe UI" w:cs="Tahoma" w:eastAsia="Segoe UI" w:hAnsi="Segoe UI"/>
-          <w:rtl/>
-        </w:rPr>
-        <w:t xml:space="preserve">Sysmon را از سایت Microsoft Sysinternals و فایل پیکربندی را از پروژه‌ی </w:t>
+        <w:t xml:space="preserve">Atomic Red Team</w:t>
+      </w:r>
+      <w:r>
+        <w:rPr>
+          <w:rFonts w:ascii="Segoe UI" w:cs="Tahoma" w:eastAsia="Segoe UI" w:hAnsi="Segoe UI"/>
+          <w:rtl/>
+        </w:rPr>
+        <w:t xml:space="preserve"> → </w:t>
       </w:r>
       <w:r>
         <w:rPr>
@@ -5761,14 +5733,31 @@
           <w:bCs/>
           <w:rtl w:val="false"/>
         </w:rPr>
-        <w:t xml:space="preserve">sysmon-modular</w:t>
-      </w:r>
-      <w:r>
-        <w:rPr>
-          <w:rFonts w:ascii="Segoe UI" w:cs="Tahoma" w:eastAsia="Segoe UI" w:hAnsi="Segoe UI"/>
-          <w:rtl/>
-        </w:rPr>
-        <w:t xml:space="preserve"> (olafhartong) دانلود کنید. این پیکربندی رویدادهای مهم مثل دسترسی به lsass (EID 10) را ثبت می‌کند.</w:t>
+        <w:t xml:space="preserve">Export rules for Splunk</w:t>
+      </w:r>
+      <w:r>
+        <w:rPr>
+          <w:rFonts w:ascii="Segoe UI" w:cs="Tahoma" w:eastAsia="Segoe UI" w:hAnsi="Segoe UI"/>
+          <w:rtl/>
+        </w:rPr>
+        <w:t xml:space="preserve"> را بزنید (مثلاً قانون‌های Production که تکنیکشان تست Atomic دارد). فایل </w:t>
+      </w:r>
+      <w:r>
+        <w:rPr>
+          <w:rFonts w:ascii="Consolas" w:cs="Consolas" w:hAnsi="Consolas"/>
+          <w:color w:val="0B6E79"/>
+          <w:sz w:val="19"/>
+          <w:szCs w:val="19"/>
+          <w:rtl w:val="false"/>
+        </w:rPr>
+        <w:t xml:space="preserve">‎savedsearches.conf‎</w:t>
+      </w:r>
+      <w:r>
+        <w:rPr>
+          <w:rFonts w:ascii="Segoe UI" w:cs="Tahoma" w:eastAsia="Segoe UI" w:hAnsi="Segoe UI"/>
+          <w:rtl/>
+        </w:rPr>
+        <w:t xml:space="preserve"> دانلود می‌شود؛ هر قانون یک جستجوی ذخیره‌شده است که هر ۵ دقیقه اجرا می‌شود و اگر نتیجه داشته باشد هشدار می‌دهد.</w:t>
       </w:r>
     </w:p>
     <w:tbl>
@@ -5816,7 +5805,7 @@
                 <w:sz w:val="17"/>
                 <w:szCs w:val="17"/>
               </w:rPr>
-              <w:t xml:space="preserve">.\Sysmon64.exe -accepteula -i .\sysmonconfig.xml</w:t>
+              <w:t xml:space="preserve">sudo mkdir -p /opt/splunk/etc/apps/detectkb_lab/local</w:t>
             </w:r>
           </w:p>
           <w:p>
@@ -5831,7 +5820,7 @@
                 <w:sz w:val="17"/>
                 <w:szCs w:val="17"/>
               </w:rPr>
-              <w:t xml:space="preserve"># Check:</w:t>
+              <w:t xml:space="preserve">sudo cp savedsearches.conf /opt/splunk/etc/apps/detectkb_lab/local/</w:t>
             </w:r>
           </w:p>
           <w:p>
@@ -5846,77 +5835,9 @@
                 <w:sz w:val="17"/>
                 <w:szCs w:val="17"/>
               </w:rPr>
-              <w:t xml:space="preserve">Get-WinEvent -LogName 'Microsoft-Windows-Sysmon/Operational' -MaxEvents 5</w:t>
-            </w:r>
-          </w:p>
-        </w:tc>
-      </w:tr>
-    </w:tbl>
-    <w:p>
-      <w:pPr>
-        <w:spacing w:after="140"/>
-      </w:pPr>
-    </w:p>
-    <w:p>
-      <w:pPr>
-        <w:pStyle w:val="Heading2"/>
-        <w:bidi/>
-      </w:pPr>
-      <w:r>
-        <w:rPr>
-          <w:rFonts w:ascii="Segoe UI" w:cs="Tahoma" w:eastAsia="Segoe UI" w:hAnsi="Segoe UI"/>
-          <w:rtl/>
-        </w:rPr>
-        <w:t xml:space="preserve">۵-۲. Audit ویندوز</w:t>
-      </w:r>
-    </w:p>
-    <w:p>
-      <w:pPr>
-        <w:bidi/>
-        <w:spacing w:after="120"/>
-        <w:jc w:val="both"/>
-      </w:pPr>
-      <w:r>
-        <w:rPr>
-          <w:rFonts w:ascii="Segoe UI" w:cs="Tahoma" w:eastAsia="Segoe UI" w:hAnsi="Segoe UI"/>
-          <w:rtl/>
-        </w:rPr>
-        <w:t xml:space="preserve">بدون این تنظیم‌ها رویدادهایی مثل 4688 (ساخت پروسه با خط فرمان) و 4104 (اسکریپت PowerShell) ثبت نمی‌شوند و بسیاری از قانون‌ها هیچ‌وقت فعال نمی‌شوند.</w:t>
-      </w:r>
-    </w:p>
-    <w:tbl>
-      <w:tblPr>
-        <w:tblW w:type="dxa" w:w="9638"/>
-        <w:tblBorders>
-          <w:top w:val="single" w:color="auto" w:sz="4"/>
-          <w:left w:val="single" w:color="auto" w:sz="4"/>
-          <w:bottom w:val="single" w:color="auto" w:sz="4"/>
-          <w:right w:val="single" w:color="auto" w:sz="4"/>
-          <w:insideH w:val="single" w:color="auto" w:sz="4"/>
-          <w:insideV w:val="single" w:color="auto" w:sz="4"/>
-        </w:tblBorders>
-      </w:tblPr>
-      <w:tblGrid>
-        <w:gridCol w:w="9638"/>
-      </w:tblGrid>
-      <w:tr>
-        <w:tc>
-          <w:tcPr>
-            <w:tcW w:type="dxa" w:w="9638"/>
-            <w:tcBorders>
-              <w:top w:val="single" w:color="D5DCE4" w:sz="4"/>
-              <w:left w:val="single" w:color="0B6E79" w:sz="16"/>
-              <w:bottom w:val="single" w:color="D5DCE4" w:sz="4"/>
-              <w:right w:val="single" w:color="D5DCE4" w:sz="4"/>
-            </w:tcBorders>
-            <w:shd w:fill="F3F5F8" w:color="auto" w:val="clear"/>
-            <w:tcMar>
-              <w:top w:type="dxa" w:w="100"/>
-              <w:left w:type="dxa" w:w="160"/>
-              <w:bottom w:type="dxa" w:w="100"/>
-              <w:right w:type="dxa" w:w="160"/>
-            </w:tcMar>
-          </w:tcPr>
+              <w:t xml:space="preserve">sudo chown -R splunk:splunk /opt/splunk/etc/apps/detectkb_lab</w:t>
+            </w:r>
+          </w:p>
           <w:p>
             <w:pPr>
               <w:spacing w:after="0" w:line="260" w:lineRule="auto"/>
@@ -5929,262 +5850,7 @@
                 <w:sz w:val="17"/>
                 <w:szCs w:val="17"/>
               </w:rPr>
-              <w:t xml:space="preserve"># Process creation (4688) with the command line</w:t>
-            </w:r>
-          </w:p>
-          <w:p>
-            <w:pPr>
-              <w:spacing w:after="0" w:line="260" w:lineRule="auto"/>
-              <w:jc w:val="left"/>
-            </w:pPr>
-            <w:r>
-              <w:rPr>
-                <w:rFonts w:ascii="Consolas" w:cs="Consolas" w:hAnsi="Consolas"/>
-                <w:color w:val="1B2533"/>
-                <w:sz w:val="17"/>
-                <w:szCs w:val="17"/>
-              </w:rPr>
-              <w:t xml:space="preserve">auditpol /set /subcategory:"Process Creation" /success:enable /failure:enable</w:t>
-            </w:r>
-          </w:p>
-          <w:p>
-            <w:pPr>
-              <w:spacing w:after="0" w:line="260" w:lineRule="auto"/>
-              <w:jc w:val="left"/>
-            </w:pPr>
-            <w:r>
-              <w:rPr>
-                <w:rFonts w:ascii="Consolas" w:cs="Consolas" w:hAnsi="Consolas"/>
-                <w:color w:val="1B2533"/>
-                <w:sz w:val="17"/>
-                <w:szCs w:val="17"/>
-              </w:rPr>
-              <w:t xml:space="preserve">reg add "HKLM\Software\Microsoft\Windows\CurrentVersion\Policies\System\Audit" /v ProcessCreationIncludeCmdLine_Enabled /t REG_DWORD /d 1 /f</w:t>
-            </w:r>
-          </w:p>
-          <w:p>
-            <w:pPr>
-              <w:spacing w:after="0" w:line="260" w:lineRule="auto"/>
-              <w:jc w:val="left"/>
-            </w:pPr>
-            <w:r>
-              <w:rPr>
-                <w:rFonts w:ascii="Consolas" w:cs="Consolas" w:hAnsi="Consolas"/>
-                <w:color w:val="1B2533"/>
-                <w:sz w:val="17"/>
-                <w:szCs w:val="17"/>
-              </w:rPr>
-              <w:t xml:space="preserve"> </w:t>
-            </w:r>
-          </w:p>
-          <w:p>
-            <w:pPr>
-              <w:spacing w:after="0" w:line="260" w:lineRule="auto"/>
-              <w:jc w:val="left"/>
-            </w:pPr>
-            <w:r>
-              <w:rPr>
-                <w:rFonts w:ascii="Consolas" w:cs="Consolas" w:hAnsi="Consolas"/>
-                <w:color w:val="1B2533"/>
-                <w:sz w:val="17"/>
-                <w:szCs w:val="17"/>
-              </w:rPr>
-              <w:t xml:space="preserve"># Other events the rules use</w:t>
-            </w:r>
-          </w:p>
-          <w:p>
-            <w:pPr>
-              <w:spacing w:after="0" w:line="260" w:lineRule="auto"/>
-              <w:jc w:val="left"/>
-            </w:pPr>
-            <w:r>
-              <w:rPr>
-                <w:rFonts w:ascii="Consolas" w:cs="Consolas" w:hAnsi="Consolas"/>
-                <w:color w:val="1B2533"/>
-                <w:sz w:val="17"/>
-                <w:szCs w:val="17"/>
-              </w:rPr>
-              <w:t xml:space="preserve">auditpol /set /subcategory:"Logon" /success:enable /failure:enable</w:t>
-            </w:r>
-          </w:p>
-          <w:p>
-            <w:pPr>
-              <w:spacing w:after="0" w:line="260" w:lineRule="auto"/>
-              <w:jc w:val="left"/>
-            </w:pPr>
-            <w:r>
-              <w:rPr>
-                <w:rFonts w:ascii="Consolas" w:cs="Consolas" w:hAnsi="Consolas"/>
-                <w:color w:val="1B2533"/>
-                <w:sz w:val="17"/>
-                <w:szCs w:val="17"/>
-              </w:rPr>
-              <w:t xml:space="preserve">auditpol /set /subcategory:"Special Logon" /success:enable</w:t>
-            </w:r>
-          </w:p>
-          <w:p>
-            <w:pPr>
-              <w:spacing w:after="0" w:line="260" w:lineRule="auto"/>
-              <w:jc w:val="left"/>
-            </w:pPr>
-            <w:r>
-              <w:rPr>
-                <w:rFonts w:ascii="Consolas" w:cs="Consolas" w:hAnsi="Consolas"/>
-                <w:color w:val="1B2533"/>
-                <w:sz w:val="17"/>
-                <w:szCs w:val="17"/>
-              </w:rPr>
-              <w:t xml:space="preserve">auditpol /set /subcategory:"User Account Management" /success:enable /failure:enable</w:t>
-            </w:r>
-          </w:p>
-          <w:p>
-            <w:pPr>
-              <w:spacing w:after="0" w:line="260" w:lineRule="auto"/>
-              <w:jc w:val="left"/>
-            </w:pPr>
-            <w:r>
-              <w:rPr>
-                <w:rFonts w:ascii="Consolas" w:cs="Consolas" w:hAnsi="Consolas"/>
-                <w:color w:val="1B2533"/>
-                <w:sz w:val="17"/>
-                <w:szCs w:val="17"/>
-              </w:rPr>
-              <w:t xml:space="preserve">auditpol /set /subcategory:"Security Group Management" /success:enable</w:t>
-            </w:r>
-          </w:p>
-          <w:p>
-            <w:pPr>
-              <w:spacing w:after="0" w:line="260" w:lineRule="auto"/>
-              <w:jc w:val="left"/>
-            </w:pPr>
-            <w:r>
-              <w:rPr>
-                <w:rFonts w:ascii="Consolas" w:cs="Consolas" w:hAnsi="Consolas"/>
-                <w:color w:val="1B2533"/>
-                <w:sz w:val="17"/>
-                <w:szCs w:val="17"/>
-              </w:rPr>
-              <w:t xml:space="preserve">auditpol /set /subcategory:"Other Object Access Events" /success:enable /failure:enable</w:t>
-            </w:r>
-          </w:p>
-          <w:p>
-            <w:pPr>
-              <w:spacing w:after="0" w:line="260" w:lineRule="auto"/>
-              <w:jc w:val="left"/>
-            </w:pPr>
-            <w:r>
-              <w:rPr>
-                <w:rFonts w:ascii="Consolas" w:cs="Consolas" w:hAnsi="Consolas"/>
-                <w:color w:val="1B2533"/>
-                <w:sz w:val="17"/>
-                <w:szCs w:val="17"/>
-              </w:rPr>
-              <w:t xml:space="preserve">auditpol /set /subcategory:"Security System Extension" /success:enable</w:t>
-            </w:r>
-          </w:p>
-          <w:p>
-            <w:pPr>
-              <w:spacing w:after="0" w:line="260" w:lineRule="auto"/>
-              <w:jc w:val="left"/>
-            </w:pPr>
-            <w:r>
-              <w:rPr>
-                <w:rFonts w:ascii="Consolas" w:cs="Consolas" w:hAnsi="Consolas"/>
-                <w:color w:val="1B2533"/>
-                <w:sz w:val="17"/>
-                <w:szCs w:val="17"/>
-              </w:rPr>
-              <w:t xml:space="preserve">auditpol /set /subcategory:"File Share" /success:enable /failure:enable</w:t>
-            </w:r>
-          </w:p>
-          <w:p>
-            <w:pPr>
-              <w:spacing w:after="0" w:line="260" w:lineRule="auto"/>
-              <w:jc w:val="left"/>
-            </w:pPr>
-            <w:r>
-              <w:rPr>
-                <w:rFonts w:ascii="Consolas" w:cs="Consolas" w:hAnsi="Consolas"/>
-                <w:color w:val="1B2533"/>
-                <w:sz w:val="17"/>
-                <w:szCs w:val="17"/>
-              </w:rPr>
-              <w:t xml:space="preserve">auditpol /set /subcategory:"Audit Policy Change" /success:enable</w:t>
-            </w:r>
-          </w:p>
-          <w:p>
-            <w:pPr>
-              <w:spacing w:after="0" w:line="260" w:lineRule="auto"/>
-              <w:jc w:val="left"/>
-            </w:pPr>
-            <w:r>
-              <w:rPr>
-                <w:rFonts w:ascii="Consolas" w:cs="Consolas" w:hAnsi="Consolas"/>
-                <w:color w:val="1B2533"/>
-                <w:sz w:val="17"/>
-                <w:szCs w:val="17"/>
-              </w:rPr>
-              <w:t xml:space="preserve"> </w:t>
-            </w:r>
-          </w:p>
-          <w:p>
-            <w:pPr>
-              <w:spacing w:after="0" w:line="260" w:lineRule="auto"/>
-              <w:jc w:val="left"/>
-            </w:pPr>
-            <w:r>
-              <w:rPr>
-                <w:rFonts w:ascii="Consolas" w:cs="Consolas" w:hAnsi="Consolas"/>
-                <w:color w:val="1B2533"/>
-                <w:sz w:val="17"/>
-                <w:szCs w:val="17"/>
-              </w:rPr>
-              <w:t xml:space="preserve"># PowerShell: Script Block (4104) and Module Logging (4103)</w:t>
-            </w:r>
-          </w:p>
-          <w:p>
-            <w:pPr>
-              <w:spacing w:after="0" w:line="260" w:lineRule="auto"/>
-              <w:jc w:val="left"/>
-            </w:pPr>
-            <w:r>
-              <w:rPr>
-                <w:rFonts w:ascii="Consolas" w:cs="Consolas" w:hAnsi="Consolas"/>
-                <w:color w:val="1B2533"/>
-                <w:sz w:val="17"/>
-                <w:szCs w:val="17"/>
-              </w:rPr>
-              <w:t xml:space="preserve">reg add "HKLM\SOFTWARE\Policies\Microsoft\Windows\PowerShell\ScriptBlockLogging" /v EnableScriptBlockLogging /t REG_DWORD /d 1 /f</w:t>
-            </w:r>
-          </w:p>
-          <w:p>
-            <w:pPr>
-              <w:spacing w:after="0" w:line="260" w:lineRule="auto"/>
-              <w:jc w:val="left"/>
-            </w:pPr>
-            <w:r>
-              <w:rPr>
-                <w:rFonts w:ascii="Consolas" w:cs="Consolas" w:hAnsi="Consolas"/>
-                <w:color w:val="1B2533"/>
-                <w:sz w:val="17"/>
-                <w:szCs w:val="17"/>
-              </w:rPr>
-              <w:t xml:space="preserve">reg add "HKLM\SOFTWARE\Policies\Microsoft\Windows\PowerShell\ModuleLogging" /v EnableModuleLogging /t REG_DWORD /d 1 /f</w:t>
-            </w:r>
-          </w:p>
-          <w:p>
-            <w:pPr>
-              <w:spacing w:after="0" w:line="260" w:lineRule="auto"/>
-              <w:jc w:val="left"/>
-            </w:pPr>
-            <w:r>
-              <w:rPr>
-                <w:rFonts w:ascii="Consolas" w:cs="Consolas" w:hAnsi="Consolas"/>
-                <w:color w:val="1B2533"/>
-                <w:sz w:val="17"/>
-                <w:szCs w:val="17"/>
-              </w:rPr>
-              <w:t xml:space="preserve">reg add "HKLM\SOFTWARE\Policies\Microsoft\Windows\PowerShell\ModuleLogging\ModuleNames" /v "*" /t REG_SZ /d "*" /f</w:t>
+              <w:t xml:space="preserve">sudo -u splunk /opt/splunk/bin/splunk restart</w:t>
             </w:r>
           </w:p>
         </w:tc>
@@ -6245,7 +5911,7 @@
                 <w:color w:val="0B6E79"/>
                 <w:rtl/>
               </w:rPr>
-              <w:t xml:space="preserve">برای DC</w:t>
+              <w:t xml:space="preserve">دیدن هشدارها</w:t>
             </w:r>
           </w:p>
           <w:p>
@@ -6259,58 +5925,23 @@
                 <w:rFonts w:ascii="Segoe UI" w:cs="Tahoma" w:eastAsia="Segoe UI" w:hAnsi="Segoe UI"/>
                 <w:rtl/>
               </w:rPr>
-              <w:t xml:space="preserve">روی DC-LAB علاوه بر این‌ها </w:t>
-            </w:r>
-            <w:r>
-              <w:rPr>
-                <w:rFonts w:ascii="Consolas" w:cs="Consolas" w:hAnsi="Consolas"/>
-                <w:color w:val="0B6E79"/>
-                <w:sz w:val="19"/>
-                <w:szCs w:val="19"/>
+              <w:t xml:space="preserve">هشدارهای فعال‌شده در Splunk در </w:t>
+            </w:r>
+            <w:r>
+              <w:rPr>
+                <w:rFonts w:ascii="Segoe UI" w:cs="Tahoma" w:eastAsia="Segoe UI" w:hAnsi="Segoe UI"/>
+                <w:b/>
+                <w:bCs/>
                 <w:rtl w:val="false"/>
               </w:rPr>
-              <w:t xml:space="preserve">‎Kerberos Service Ticket Operations‎</w:t>
-            </w:r>
-            <w:r>
-              <w:rPr>
-                <w:rFonts w:ascii="Segoe UI" w:cs="Tahoma" w:eastAsia="Segoe UI" w:hAnsi="Segoe UI"/>
-                <w:rtl/>
-              </w:rPr>
-              <w:t xml:space="preserve">، </w:t>
-            </w:r>
-            <w:r>
-              <w:rPr>
-                <w:rFonts w:ascii="Consolas" w:cs="Consolas" w:hAnsi="Consolas"/>
-                <w:color w:val="0B6E79"/>
-                <w:sz w:val="19"/>
-                <w:szCs w:val="19"/>
-                <w:rtl w:val="false"/>
-              </w:rPr>
-              <w:t xml:space="preserve">‎Kerberos Authentication Service‎</w:t>
-            </w:r>
-            <w:r>
-              <w:rPr>
-                <w:rFonts w:ascii="Segoe UI" w:cs="Tahoma" w:eastAsia="Segoe UI" w:hAnsi="Segoe UI"/>
-                <w:rtl/>
-              </w:rPr>
-              <w:t xml:space="preserve"> و </w:t>
-            </w:r>
-            <w:r>
-              <w:rPr>
-                <w:rFonts w:ascii="Consolas" w:cs="Consolas" w:hAnsi="Consolas"/>
-                <w:color w:val="0B6E79"/>
-                <w:sz w:val="19"/>
-                <w:szCs w:val="19"/>
-                <w:rtl w:val="false"/>
-              </w:rPr>
-              <w:t xml:space="preserve">‎Directory Service Changes‎</w:t>
-            </w:r>
-            <w:r>
-              <w:rPr>
-                <w:rFonts w:ascii="Segoe UI" w:cs="Tahoma" w:eastAsia="Segoe UI" w:hAnsi="Segoe UI"/>
-                <w:rtl/>
-              </w:rPr>
-              <w:t xml:space="preserve"> را هم فعال کنید (برای 4769، 4768 و 5136).</w:t>
+              <w:t xml:space="preserve">Activity → Triggered Alerts</w:t>
+            </w:r>
+            <w:r>
+              <w:rPr>
+                <w:rFonts w:ascii="Segoe UI" w:cs="Tahoma" w:eastAsia="Segoe UI" w:hAnsi="Segoe UI"/>
+                <w:rtl/>
+              </w:rPr>
+              <w:t xml:space="preserve"> دیده می‌شوند. هر بار قانون‌ها در DetectKB تغییر کردند، فایل را دوباره خروجی بگیرید و جایگزین کنید.</w:t>
             </w:r>
           </w:p>
         </w:tc>
@@ -6323,6 +5954,50 @@
     </w:p>
     <w:p>
       <w:pPr>
+        <w:pStyle w:val="Heading1"/>
+        <w:pageBreakBefore/>
+        <w:bidi/>
+      </w:pPr>
+      <w:r>
+        <w:rPr>
+          <w:rFonts w:ascii="Segoe UI" w:cs="Tahoma" w:eastAsia="Segoe UI" w:hAnsi="Segoe UI"/>
+          <w:rtl/>
+        </w:rPr>
+        <w:t xml:space="preserve">۵. راه‌اندازی WIN-VICTIM</w:t>
+      </w:r>
+    </w:p>
+    <w:p>
+      <w:pPr>
+        <w:bidi/>
+        <w:spacing w:after="120"/>
+        <w:jc w:val="both"/>
+      </w:pPr>
+      <w:r>
+        <w:rPr>
+          <w:rFonts w:ascii="Segoe UI" w:cs="Tahoma" w:eastAsia="Segoe UI" w:hAnsi="Segoe UI"/>
+          <w:rtl/>
+        </w:rPr>
+        <w:t xml:space="preserve">این مراحل را روی WIN-VICTIM (و بعداً DC-LAB) با PowerShell در حالت </w:t>
+      </w:r>
+      <w:r>
+        <w:rPr>
+          <w:rFonts w:ascii="Segoe UI" w:cs="Tahoma" w:eastAsia="Segoe UI" w:hAnsi="Segoe UI"/>
+          <w:b/>
+          <w:bCs/>
+          <w:rtl w:val="false"/>
+        </w:rPr>
+        <w:t xml:space="preserve">Administrator</w:t>
+      </w:r>
+      <w:r>
+        <w:rPr>
+          <w:rFonts w:ascii="Segoe UI" w:cs="Tahoma" w:eastAsia="Segoe UI" w:hAnsi="Segoe UI"/>
+          <w:rtl/>
+        </w:rPr>
+        <w:t xml:space="preserve"> اجرا کنید.</w:t>
+      </w:r>
+    </w:p>
+    <w:p>
+      <w:pPr>
         <w:pStyle w:val="Heading2"/>
         <w:bidi/>
       </w:pPr>
@@ -6331,7 +6006,37 @@
           <w:rFonts w:ascii="Segoe UI" w:cs="Tahoma" w:eastAsia="Segoe UI" w:hAnsi="Segoe UI"/>
           <w:rtl/>
         </w:rPr>
-        <w:t xml:space="preserve">۵-۳. Splunk Universal Forwarder</w:t>
+        <w:t xml:space="preserve">۵-۱. Sysmon</w:t>
+      </w:r>
+    </w:p>
+    <w:p>
+      <w:pPr>
+        <w:bidi/>
+        <w:spacing w:after="120"/>
+        <w:jc w:val="both"/>
+      </w:pPr>
+      <w:r>
+        <w:rPr>
+          <w:rFonts w:ascii="Segoe UI" w:cs="Tahoma" w:eastAsia="Segoe UI" w:hAnsi="Segoe UI"/>
+          <w:rtl/>
+        </w:rPr>
+        <w:t xml:space="preserve">Sysmon را از سایت Microsoft Sysinternals و فایل پیکربندی را از پروژه‌ی </w:t>
+      </w:r>
+      <w:r>
+        <w:rPr>
+          <w:rFonts w:ascii="Segoe UI" w:cs="Tahoma" w:eastAsia="Segoe UI" w:hAnsi="Segoe UI"/>
+          <w:b/>
+          <w:bCs/>
+          <w:rtl w:val="false"/>
+        </w:rPr>
+        <w:t xml:space="preserve">sysmon-modular</w:t>
+      </w:r>
+      <w:r>
+        <w:rPr>
+          <w:rFonts w:ascii="Segoe UI" w:cs="Tahoma" w:eastAsia="Segoe UI" w:hAnsi="Segoe UI"/>
+          <w:rtl/>
+        </w:rPr>
+        <w:t xml:space="preserve"> (olafhartong) دانلود کنید. این پیکربندی رویدادهای مهم مثل دسترسی به lsass (EID 10) را ثبت می‌کند.</w:t>
       </w:r>
     </w:p>
     <w:tbl>
@@ -6379,7 +6084,37 @@
                 <w:sz w:val="17"/>
                 <w:szCs w:val="17"/>
               </w:rPr>
-              <w:t xml:space="preserve">msiexec.exe /i splunkforwarder-&lt;version&gt;-x64-release.msi AGREETOLICENSE=Yes RECEIVING_INDEXER="10.50.0.10:9997" SPLUNKUSERNAME=admin SPLUNKPASSWORD="CHANGE-ME-UF" /quiet</w:t>
+              <w:t xml:space="preserve">.\Sysmon64.exe -accepteula -i .\sysmonconfig.xml</w:t>
+            </w:r>
+          </w:p>
+          <w:p>
+            <w:pPr>
+              <w:spacing w:after="0" w:line="260" w:lineRule="auto"/>
+              <w:jc w:val="left"/>
+            </w:pPr>
+            <w:r>
+              <w:rPr>
+                <w:rFonts w:ascii="Consolas" w:cs="Consolas" w:hAnsi="Consolas"/>
+                <w:color w:val="1B2533"/>
+                <w:sz w:val="17"/>
+                <w:szCs w:val="17"/>
+              </w:rPr>
+              <w:t xml:space="preserve"># Check:</w:t>
+            </w:r>
+          </w:p>
+          <w:p>
+            <w:pPr>
+              <w:spacing w:after="0" w:line="260" w:lineRule="auto"/>
+              <w:jc w:val="left"/>
+            </w:pPr>
+            <w:r>
+              <w:rPr>
+                <w:rFonts w:ascii="Consolas" w:cs="Consolas" w:hAnsi="Consolas"/>
+                <w:color w:val="1B2533"/>
+                <w:sz w:val="17"/>
+                <w:szCs w:val="17"/>
+              </w:rPr>
+              <w:t xml:space="preserve">Get-WinEvent -LogName 'Microsoft-Windows-Sysmon/Operational' -MaxEvents 5</w:t>
             </w:r>
           </w:p>
         </w:tc>
@@ -6389,6 +6124,19 @@
       <w:pPr>
         <w:spacing w:after="140"/>
       </w:pPr>
+    </w:p>
+    <w:p>
+      <w:pPr>
+        <w:pStyle w:val="Heading2"/>
+        <w:bidi/>
+      </w:pPr>
+      <w:r>
+        <w:rPr>
+          <w:rFonts w:ascii="Segoe UI" w:cs="Tahoma" w:eastAsia="Segoe UI" w:hAnsi="Segoe UI"/>
+          <w:rtl/>
+        </w:rPr>
+        <w:t xml:space="preserve">۵-۲. Audit ویندوز</w:t>
+      </w:r>
     </w:p>
     <w:p>
       <w:pPr>
@@ -6401,24 +6149,7 @@
           <w:rFonts w:ascii="Segoe UI" w:cs="Tahoma" w:eastAsia="Segoe UI" w:hAnsi="Segoe UI"/>
           <w:rtl/>
         </w:rPr>
-        <w:t xml:space="preserve">سپس فایل </w:t>
-      </w:r>
-      <w:r>
-        <w:rPr>
-          <w:rFonts w:ascii="Consolas" w:cs="Consolas" w:hAnsi="Consolas"/>
-          <w:color w:val="0B6E79"/>
-          <w:sz w:val="19"/>
-          <w:szCs w:val="19"/>
-          <w:rtl w:val="false"/>
-        </w:rPr>
-        <w:t xml:space="preserve">‎C:\Program Files\SplunkUniversalForwarder\etc\system\local\inputs.conf‎</w:t>
-      </w:r>
-      <w:r>
-        <w:rPr>
-          <w:rFonts w:ascii="Segoe UI" w:cs="Tahoma" w:eastAsia="Segoe UI" w:hAnsi="Segoe UI"/>
-          <w:rtl/>
-        </w:rPr>
-        <w:t xml:space="preserve"> را با این محتوا بسازید و سرویس SplunkForwarder را ری‌استارت کنید:</w:t>
+        <w:t xml:space="preserve">بدون این تنظیم‌ها رویدادهایی مثل 4688 (ساخت پروسه با خط فرمان) و 4104 (اسکریپت PowerShell) ثبت نمی‌شوند و بسیاری از قانون‌ها هیچ‌وقت فعال نمی‌شوند.</w:t>
       </w:r>
     </w:p>
     <w:tbl>
@@ -6466,7 +6197,7 @@
                 <w:sz w:val="17"/>
                 <w:szCs w:val="17"/>
               </w:rPr>
-              <w:t xml:space="preserve">[WinEventLog://Security]</w:t>
+              <w:t xml:space="preserve"># Process creation (4688) with the command line</w:t>
             </w:r>
           </w:p>
           <w:p>
@@ -6481,7 +6212,7 @@
                 <w:sz w:val="17"/>
                 <w:szCs w:val="17"/>
               </w:rPr>
-              <w:t xml:space="preserve">disabled = 0</w:t>
+              <w:t xml:space="preserve">auditpol /set /subcategory:"Process Creation" /success:enable /failure:enable</w:t>
             </w:r>
           </w:p>
           <w:p>
@@ -6496,7 +6227,7 @@
                 <w:sz w:val="17"/>
                 <w:szCs w:val="17"/>
               </w:rPr>
-              <w:t xml:space="preserve">renderXml = true</w:t>
+              <w:t xml:space="preserve">reg add "HKLM\Software\Microsoft\Windows\CurrentVersion\Policies\System\Audit" /v ProcessCreationIncludeCmdLine_Enabled /t REG_DWORD /d 1 /f</w:t>
             </w:r>
           </w:p>
           <w:p>
@@ -6511,7 +6242,7 @@
                 <w:sz w:val="17"/>
                 <w:szCs w:val="17"/>
               </w:rPr>
-              <w:t xml:space="preserve">index = win</w:t>
+              <w:t xml:space="preserve"> </w:t>
             </w:r>
           </w:p>
           <w:p>
@@ -6526,7 +6257,7 @@
                 <w:sz w:val="17"/>
                 <w:szCs w:val="17"/>
               </w:rPr>
-              <w:t xml:space="preserve"> </w:t>
+              <w:t xml:space="preserve"># Other events the rules use</w:t>
             </w:r>
           </w:p>
           <w:p>
@@ -6541,7 +6272,7 @@
                 <w:sz w:val="17"/>
                 <w:szCs w:val="17"/>
               </w:rPr>
-              <w:t xml:space="preserve">[WinEventLog://System]</w:t>
+              <w:t xml:space="preserve">auditpol /set /subcategory:"Logon" /success:enable /failure:enable</w:t>
             </w:r>
           </w:p>
           <w:p>
@@ -6556,7 +6287,7 @@
                 <w:sz w:val="17"/>
                 <w:szCs w:val="17"/>
               </w:rPr>
-              <w:t xml:space="preserve">disabled = 0</w:t>
+              <w:t xml:space="preserve">auditpol /set /subcategory:"Special Logon" /success:enable</w:t>
             </w:r>
           </w:p>
           <w:p>
@@ -6571,7 +6302,7 @@
                 <w:sz w:val="17"/>
                 <w:szCs w:val="17"/>
               </w:rPr>
-              <w:t xml:space="preserve">renderXml = true</w:t>
+              <w:t xml:space="preserve">auditpol /set /subcategory:"User Account Management" /success:enable /failure:enable</w:t>
             </w:r>
           </w:p>
           <w:p>
@@ -6586,7 +6317,7 @@
                 <w:sz w:val="17"/>
                 <w:szCs w:val="17"/>
               </w:rPr>
-              <w:t xml:space="preserve">index = win</w:t>
+              <w:t xml:space="preserve">auditpol /set /subcategory:"Security Group Management" /success:enable</w:t>
             </w:r>
           </w:p>
           <w:p>
@@ -6601,7 +6332,7 @@
                 <w:sz w:val="17"/>
                 <w:szCs w:val="17"/>
               </w:rPr>
-              <w:t xml:space="preserve"> </w:t>
+              <w:t xml:space="preserve">auditpol /set /subcategory:"Other Object Access Events" /success:enable /failure:enable</w:t>
             </w:r>
           </w:p>
           <w:p>
@@ -6616,7 +6347,7 @@
                 <w:sz w:val="17"/>
                 <w:szCs w:val="17"/>
               </w:rPr>
-              <w:t xml:space="preserve">[WinEventLog://Microsoft-Windows-PowerShell/Operational]</w:t>
+              <w:t xml:space="preserve">auditpol /set /subcategory:"Security System Extension" /success:enable</w:t>
             </w:r>
           </w:p>
           <w:p>
@@ -6631,7 +6362,7 @@
                 <w:sz w:val="17"/>
                 <w:szCs w:val="17"/>
               </w:rPr>
-              <w:t xml:space="preserve">disabled = 0</w:t>
+              <w:t xml:space="preserve">auditpol /set /subcategory:"File Share" /success:enable /failure:enable</w:t>
             </w:r>
           </w:p>
           <w:p>
@@ -6646,7 +6377,7 @@
                 <w:sz w:val="17"/>
                 <w:szCs w:val="17"/>
               </w:rPr>
-              <w:t xml:space="preserve">renderXml = true</w:t>
+              <w:t xml:space="preserve">auditpol /set /subcategory:"Audit Policy Change" /success:enable</w:t>
             </w:r>
           </w:p>
           <w:p>
@@ -6661,7 +6392,7 @@
                 <w:sz w:val="17"/>
                 <w:szCs w:val="17"/>
               </w:rPr>
-              <w:t xml:space="preserve">index = win</w:t>
+              <w:t xml:space="preserve"> </w:t>
             </w:r>
           </w:p>
           <w:p>
@@ -6676,7 +6407,7 @@
                 <w:sz w:val="17"/>
                 <w:szCs w:val="17"/>
               </w:rPr>
-              <w:t xml:space="preserve"> </w:t>
+              <w:t xml:space="preserve"># PowerShell: Script Block (4104) and Module Logging (4103)</w:t>
             </w:r>
           </w:p>
           <w:p>
@@ -6691,7 +6422,7 @@
                 <w:sz w:val="17"/>
                 <w:szCs w:val="17"/>
               </w:rPr>
-              <w:t xml:space="preserve">[WinEventLog://Microsoft-Windows-Sysmon/Operational]</w:t>
+              <w:t xml:space="preserve">reg add "HKLM\SOFTWARE\Policies\Microsoft\Windows\PowerShell\ScriptBlockLogging" /v EnableScriptBlockLogging /t REG_DWORD /d 1 /f</w:t>
             </w:r>
           </w:p>
           <w:p>
@@ -6706,7 +6437,7 @@
                 <w:sz w:val="17"/>
                 <w:szCs w:val="17"/>
               </w:rPr>
-              <w:t xml:space="preserve">disabled = 0</w:t>
+              <w:t xml:space="preserve">reg add "HKLM\SOFTWARE\Policies\Microsoft\Windows\PowerShell\ModuleLogging" /v EnableModuleLogging /t REG_DWORD /d 1 /f</w:t>
             </w:r>
           </w:p>
           <w:p>
@@ -6721,773 +6452,7 @@
                 <w:sz w:val="17"/>
                 <w:szCs w:val="17"/>
               </w:rPr>
-              <w:t xml:space="preserve">renderXml = true</w:t>
-            </w:r>
-          </w:p>
-          <w:p>
-            <w:pPr>
-              <w:spacing w:after="0" w:line="260" w:lineRule="auto"/>
-              <w:jc w:val="left"/>
-            </w:pPr>
-            <w:r>
-              <w:rPr>
-                <w:rFonts w:ascii="Consolas" w:cs="Consolas" w:hAnsi="Consolas"/>
-                <w:color w:val="1B2533"/>
-                <w:sz w:val="17"/>
-                <w:szCs w:val="17"/>
-              </w:rPr>
-              <w:t xml:space="preserve">index = sysmon</w:t>
-            </w:r>
-          </w:p>
-          <w:p>
-            <w:pPr>
-              <w:spacing w:after="0" w:line="260" w:lineRule="auto"/>
-              <w:jc w:val="left"/>
-            </w:pPr>
-            <w:r>
-              <w:rPr>
-                <w:rFonts w:ascii="Consolas" w:cs="Consolas" w:hAnsi="Consolas"/>
-                <w:color w:val="1B2533"/>
-                <w:sz w:val="17"/>
-                <w:szCs w:val="17"/>
-              </w:rPr>
-              <w:t xml:space="preserve"> </w:t>
-            </w:r>
-          </w:p>
-          <w:p>
-            <w:pPr>
-              <w:spacing w:after="0" w:line="260" w:lineRule="auto"/>
-              <w:jc w:val="left"/>
-            </w:pPr>
-            <w:r>
-              <w:rPr>
-                <w:rFonts w:ascii="Consolas" w:cs="Consolas" w:hAnsi="Consolas"/>
-                <w:color w:val="1B2533"/>
-                <w:sz w:val="17"/>
-                <w:szCs w:val="17"/>
-              </w:rPr>
-              <w:t xml:space="preserve">[WinEventLog://Microsoft-Windows-TaskScheduler/Operational]</w:t>
-            </w:r>
-          </w:p>
-          <w:p>
-            <w:pPr>
-              <w:spacing w:after="0" w:line="260" w:lineRule="auto"/>
-              <w:jc w:val="left"/>
-            </w:pPr>
-            <w:r>
-              <w:rPr>
-                <w:rFonts w:ascii="Consolas" w:cs="Consolas" w:hAnsi="Consolas"/>
-                <w:color w:val="1B2533"/>
-                <w:sz w:val="17"/>
-                <w:szCs w:val="17"/>
-              </w:rPr>
-              <w:t xml:space="preserve">disabled = 0</w:t>
-            </w:r>
-          </w:p>
-          <w:p>
-            <w:pPr>
-              <w:spacing w:after="0" w:line="260" w:lineRule="auto"/>
-              <w:jc w:val="left"/>
-            </w:pPr>
-            <w:r>
-              <w:rPr>
-                <w:rFonts w:ascii="Consolas" w:cs="Consolas" w:hAnsi="Consolas"/>
-                <w:color w:val="1B2533"/>
-                <w:sz w:val="17"/>
-                <w:szCs w:val="17"/>
-              </w:rPr>
-              <w:t xml:space="preserve">renderXml = true</w:t>
-            </w:r>
-          </w:p>
-          <w:p>
-            <w:pPr>
-              <w:spacing w:after="0" w:line="260" w:lineRule="auto"/>
-              <w:jc w:val="left"/>
-            </w:pPr>
-            <w:r>
-              <w:rPr>
-                <w:rFonts w:ascii="Consolas" w:cs="Consolas" w:hAnsi="Consolas"/>
-                <w:color w:val="1B2533"/>
-                <w:sz w:val="17"/>
-                <w:szCs w:val="17"/>
-              </w:rPr>
-              <w:t xml:space="preserve">index = win</w:t>
-            </w:r>
-          </w:p>
-        </w:tc>
-      </w:tr>
-    </w:tbl>
-    <w:p>
-      <w:pPr>
-        <w:spacing w:after="140"/>
-      </w:pPr>
-    </w:p>
-    <w:tbl>
-      <w:tblPr>
-        <w:tblW w:type="dxa" w:w="9638"/>
-        <w:tblBorders>
-          <w:top w:val="single" w:color="auto" w:sz="4"/>
-          <w:left w:val="single" w:color="auto" w:sz="4"/>
-          <w:bottom w:val="single" w:color="auto" w:sz="4"/>
-          <w:right w:val="single" w:color="auto" w:sz="4"/>
-          <w:insideH w:val="single" w:color="auto" w:sz="4"/>
-          <w:insideV w:val="single" w:color="auto" w:sz="4"/>
-        </w:tblBorders>
-      </w:tblPr>
-      <w:tblGrid>
-        <w:gridCol w:w="9638"/>
-      </w:tblGrid>
-      <w:tr>
-        <w:tc>
-          <w:tcPr>
-            <w:tcW w:type="dxa" w:w="9638"/>
-            <w:tcBorders>
-              <w:top w:val="single" w:color="D5DCE4" w:sz="4"/>
-              <w:left w:val="single" w:color="0B6E79" w:sz="16"/>
-              <w:bottom w:val="single" w:color="D5DCE4" w:sz="4"/>
-              <w:right w:val="single" w:color="D5DCE4" w:sz="4"/>
-            </w:tcBorders>
-            <w:shd w:fill="F3F5F8" w:color="auto" w:val="clear"/>
-            <w:tcMar>
-              <w:top w:type="dxa" w:w="100"/>
-              <w:left w:type="dxa" w:w="160"/>
-              <w:bottom w:type="dxa" w:w="100"/>
-              <w:right w:type="dxa" w:w="160"/>
-            </w:tcMar>
-          </w:tcPr>
-          <w:p>
-            <w:pPr>
-              <w:spacing w:after="0" w:line="260" w:lineRule="auto"/>
-              <w:jc w:val="left"/>
-            </w:pPr>
-            <w:r>
-              <w:rPr>
-                <w:rFonts w:ascii="Consolas" w:cs="Consolas" w:hAnsi="Consolas"/>
-                <w:color w:val="1B2533"/>
-                <w:sz w:val="17"/>
-                <w:szCs w:val="17"/>
-              </w:rPr>
-              <w:t xml:space="preserve">Restart-Service SplunkForwarder</w:t>
-            </w:r>
-          </w:p>
-        </w:tc>
-      </w:tr>
-    </w:tbl>
-    <w:p>
-      <w:pPr>
-        <w:spacing w:after="140"/>
-      </w:pPr>
-    </w:p>
-    <w:p>
-      <w:pPr>
-        <w:pStyle w:val="Heading2"/>
-        <w:bidi/>
-      </w:pPr>
-      <w:r>
-        <w:rPr>
-          <w:rFonts w:ascii="Segoe UI" w:cs="Tahoma" w:eastAsia="Segoe UI" w:hAnsi="Segoe UI"/>
-          <w:rtl/>
-        </w:rPr>
-        <w:t xml:space="preserve">۵-۴. آنتی‌ویروس (Defender)</w:t>
-      </w:r>
-    </w:p>
-    <w:p>
-      <w:pPr>
-        <w:bidi/>
-        <w:spacing w:after="120"/>
-        <w:jc w:val="both"/>
-      </w:pPr>
-      <w:r>
-        <w:rPr>
-          <w:rFonts w:ascii="Segoe UI" w:cs="Tahoma" w:eastAsia="Segoe UI" w:hAnsi="Segoe UI"/>
-          <w:rtl/>
-        </w:rPr>
-        <w:t xml:space="preserve">خیلی از تست‌های Atomic را Defender قبل از اجرا متوقف می‌کند. دو حالت هر دو مفیدند، ولی باید مشخص باشد در کدام حالت تست کرده‌اید:</w:t>
-      </w:r>
-    </w:p>
-    <w:p>
-      <w:pPr>
-        <w:pStyle w:val="ListParagraph"/>
-        <w:numPr>
-          <w:ilvl w:val="0"/>
-          <w:numId w:val="2"/>
-        </w:numPr>
-        <w:bidi/>
-        <w:spacing w:after="60"/>
-      </w:pPr>
-      <w:r>
-        <w:rPr>
-          <w:rFonts w:ascii="Segoe UI" w:cs="Tahoma" w:eastAsia="Segoe UI" w:hAnsi="Segoe UI"/>
-          <w:b/>
-          <w:bCs/>
-          <w:rtl/>
-        </w:rPr>
-        <w:t xml:space="preserve">حالت تست قانون (پیشنهادی برای شروع):</w:t>
-      </w:r>
-      <w:r>
-        <w:rPr>
-          <w:rFonts w:ascii="Segoe UI" w:cs="Tahoma" w:eastAsia="Segoe UI" w:hAnsi="Segoe UI"/>
-          <w:rtl/>
-        </w:rPr>
-        <w:t xml:space="preserve"> برای پوشه‌ی </w:t>
-      </w:r>
-      <w:r>
-        <w:rPr>
-          <w:rFonts w:ascii="Consolas" w:cs="Consolas" w:hAnsi="Consolas"/>
-          <w:color w:val="0B6E79"/>
-          <w:sz w:val="19"/>
-          <w:szCs w:val="19"/>
-          <w:rtl w:val="false"/>
-        </w:rPr>
-        <w:t xml:space="preserve">‎C:\AtomicRedTeam‎</w:t>
-      </w:r>
-      <w:r>
-        <w:rPr>
-          <w:rFonts w:ascii="Segoe UI" w:cs="Tahoma" w:eastAsia="Segoe UI" w:hAnsi="Segoe UI"/>
-          <w:rtl/>
-        </w:rPr>
-        <w:t xml:space="preserve"> استثنا (Exclusion) تعریف کنید تا حمله اجرا شود و ببینیم قانون SIEM آن را می‌گیرد یا نه.</w:t>
-      </w:r>
-    </w:p>
-    <w:p>
-      <w:pPr>
-        <w:pStyle w:val="ListParagraph"/>
-        <w:numPr>
-          <w:ilvl w:val="0"/>
-          <w:numId w:val="2"/>
-        </w:numPr>
-        <w:bidi/>
-        <w:spacing w:after="60"/>
-      </w:pPr>
-      <w:r>
-        <w:rPr>
-          <w:rFonts w:ascii="Segoe UI" w:cs="Tahoma" w:eastAsia="Segoe UI" w:hAnsi="Segoe UI"/>
-          <w:b/>
-          <w:bCs/>
-          <w:rtl/>
-        </w:rPr>
-        <w:t xml:space="preserve">حالت واقعی:</w:t>
-      </w:r>
-      <w:r>
-        <w:rPr>
-          <w:rFonts w:ascii="Segoe UI" w:cs="Tahoma" w:eastAsia="Segoe UI" w:hAnsi="Segoe UI"/>
-          <w:rtl/>
-        </w:rPr>
-        <w:t xml:space="preserve"> Defender کامل روشن؛ نشان می‌دهد در عمل چه چیزی جلوی حمله را می‌گیرد.</w:t>
-      </w:r>
-    </w:p>
-    <w:tbl>
-      <w:tblPr>
-        <w:tblW w:type="dxa" w:w="9638"/>
-        <w:tblBorders>
-          <w:top w:val="single" w:color="auto" w:sz="4"/>
-          <w:left w:val="single" w:color="auto" w:sz="4"/>
-          <w:bottom w:val="single" w:color="auto" w:sz="4"/>
-          <w:right w:val="single" w:color="auto" w:sz="4"/>
-          <w:insideH w:val="single" w:color="auto" w:sz="4"/>
-          <w:insideV w:val="single" w:color="auto" w:sz="4"/>
-        </w:tblBorders>
-      </w:tblPr>
-      <w:tblGrid>
-        <w:gridCol w:w="9638"/>
-      </w:tblGrid>
-      <w:tr>
-        <w:tc>
-          <w:tcPr>
-            <w:tcW w:type="dxa" w:w="9638"/>
-            <w:tcBorders>
-              <w:top w:val="single" w:color="D5DCE4" w:sz="4"/>
-              <w:left w:val="single" w:color="0B6E79" w:sz="16"/>
-              <w:bottom w:val="single" w:color="D5DCE4" w:sz="4"/>
-              <w:right w:val="single" w:color="D5DCE4" w:sz="4"/>
-            </w:tcBorders>
-            <w:shd w:fill="F3F5F8" w:color="auto" w:val="clear"/>
-            <w:tcMar>
-              <w:top w:type="dxa" w:w="100"/>
-              <w:left w:type="dxa" w:w="160"/>
-              <w:bottom w:type="dxa" w:w="100"/>
-              <w:right w:type="dxa" w:w="160"/>
-            </w:tcMar>
-          </w:tcPr>
-          <w:p>
-            <w:pPr>
-              <w:spacing w:after="0" w:line="260" w:lineRule="auto"/>
-              <w:jc w:val="left"/>
-            </w:pPr>
-            <w:r>
-              <w:rPr>
-                <w:rFonts w:ascii="Consolas" w:cs="Consolas" w:hAnsi="Consolas"/>
-                <w:color w:val="1B2533"/>
-                <w:sz w:val="17"/>
-                <w:szCs w:val="17"/>
-              </w:rPr>
-              <w:t xml:space="preserve">Add-MpPreference -ExclusionPath 'C:\AtomicRedTeam'</w:t>
-            </w:r>
-          </w:p>
-        </w:tc>
-      </w:tr>
-    </w:tbl>
-    <w:p>
-      <w:pPr>
-        <w:spacing w:after="140"/>
-      </w:pPr>
-    </w:p>
-    <w:p>
-      <w:pPr>
-        <w:pStyle w:val="Heading1"/>
-        <w:pageBreakBefore/>
-        <w:bidi/>
-      </w:pPr>
-      <w:r>
-        <w:rPr>
-          <w:rFonts w:ascii="Segoe UI" w:cs="Tahoma" w:eastAsia="Segoe UI" w:hAnsi="Segoe UI"/>
-          <w:rtl/>
-        </w:rPr>
-        <w:t xml:space="preserve">۶. DC-LAB و LNX-VICTIM (اختیاری)</w:t>
-      </w:r>
-    </w:p>
-    <w:p>
-      <w:pPr>
-        <w:pStyle w:val="Heading2"/>
-        <w:bidi/>
-      </w:pPr>
-      <w:r>
-        <w:rPr>
-          <w:rFonts w:ascii="Segoe UI" w:cs="Tahoma" w:eastAsia="Segoe UI" w:hAnsi="Segoe UI"/>
-          <w:rtl/>
-        </w:rPr>
-        <w:t xml:space="preserve">DC-LAB</w:t>
-      </w:r>
-    </w:p>
-    <w:p>
-      <w:pPr>
-        <w:bidi/>
-        <w:spacing w:after="60"/>
-        <w:ind w:right="200"/>
-      </w:pPr>
-      <w:r>
-        <w:rPr>
-          <w:rFonts w:ascii="Segoe UI" w:cs="Tahoma" w:eastAsia="Segoe UI" w:hAnsi="Segoe UI"/>
-          <w:color w:val="0B6E79"/>
-        </w:rPr>
-        <w:t xml:space="preserve">☐  </w:t>
-      </w:r>
-      <w:r>
-        <w:rPr>
-          <w:rFonts w:ascii="Segoe UI" w:cs="Tahoma" w:eastAsia="Segoe UI" w:hAnsi="Segoe UI"/>
-          <w:rtl/>
-        </w:rPr>
-        <w:t xml:space="preserve">Windows Server 2022 نصب و نقش </w:t>
-      </w:r>
-      <w:r>
-        <w:rPr>
-          <w:rFonts w:ascii="Segoe UI" w:cs="Tahoma" w:eastAsia="Segoe UI" w:hAnsi="Segoe UI"/>
-          <w:b/>
-          <w:bCs/>
-          <w:rtl w:val="false"/>
-        </w:rPr>
-        <w:t xml:space="preserve">AD DS</w:t>
-      </w:r>
-      <w:r>
-        <w:rPr>
-          <w:rFonts w:ascii="Segoe UI" w:cs="Tahoma" w:eastAsia="Segoe UI" w:hAnsi="Segoe UI"/>
-          <w:rtl/>
-        </w:rPr>
-        <w:t xml:space="preserve"> با دامنه‌ی جدا (مثلاً </w:t>
-      </w:r>
-      <w:r>
-        <w:rPr>
-          <w:rFonts w:ascii="Consolas" w:cs="Consolas" w:hAnsi="Consolas"/>
-          <w:color w:val="0B6E79"/>
-          <w:sz w:val="19"/>
-          <w:szCs w:val="19"/>
-          <w:rtl w:val="false"/>
-        </w:rPr>
-        <w:t xml:space="preserve">‎lab.local‎</w:t>
-      </w:r>
-      <w:r>
-        <w:rPr>
-          <w:rFonts w:ascii="Segoe UI" w:cs="Tahoma" w:eastAsia="Segoe UI" w:hAnsi="Segoe UI"/>
-          <w:rtl/>
-        </w:rPr>
-        <w:t xml:space="preserve">) راه‌اندازی شود — هیچ Trust با دامنه‌ی سازمان.</w:t>
-      </w:r>
-    </w:p>
-    <w:p>
-      <w:pPr>
-        <w:bidi/>
-        <w:spacing w:after="60"/>
-        <w:ind w:right="200"/>
-      </w:pPr>
-      <w:r>
-        <w:rPr>
-          <w:rFonts w:ascii="Segoe UI" w:cs="Tahoma" w:eastAsia="Segoe UI" w:hAnsi="Segoe UI"/>
-          <w:color w:val="0B6E79"/>
-        </w:rPr>
-        <w:t xml:space="preserve">☐  </w:t>
-      </w:r>
-      <w:r>
-        <w:rPr>
-          <w:rFonts w:ascii="Segoe UI" w:cs="Tahoma" w:eastAsia="Segoe UI" w:hAnsi="Segoe UI"/>
-          <w:rtl/>
-        </w:rPr>
-        <w:t xml:space="preserve">WIN-VICTIM عضو دامنه‌ی </w:t>
-      </w:r>
-      <w:r>
-        <w:rPr>
-          <w:rFonts w:ascii="Consolas" w:cs="Consolas" w:hAnsi="Consolas"/>
-          <w:color w:val="0B6E79"/>
-          <w:sz w:val="19"/>
-          <w:szCs w:val="19"/>
-          <w:rtl w:val="false"/>
-        </w:rPr>
-        <w:t xml:space="preserve">‎lab.local‎</w:t>
-      </w:r>
-      <w:r>
-        <w:rPr>
-          <w:rFonts w:ascii="Segoe UI" w:cs="Tahoma" w:eastAsia="Segoe UI" w:hAnsi="Segoe UI"/>
-          <w:rtl/>
-        </w:rPr>
-        <w:t xml:space="preserve"> شود.</w:t>
-      </w:r>
-    </w:p>
-    <w:p>
-      <w:pPr>
-        <w:bidi/>
-        <w:spacing w:after="60"/>
-        <w:ind w:right="200"/>
-      </w:pPr>
-      <w:r>
-        <w:rPr>
-          <w:rFonts w:ascii="Segoe UI" w:cs="Tahoma" w:eastAsia="Segoe UI" w:hAnsi="Segoe UI"/>
-          <w:color w:val="0B6E79"/>
-        </w:rPr>
-        <w:t xml:space="preserve">☐  </w:t>
-      </w:r>
-      <w:r>
-        <w:rPr>
-          <w:rFonts w:ascii="Segoe UI" w:cs="Tahoma" w:eastAsia="Segoe UI" w:hAnsi="Segoe UI"/>
-          <w:rtl/>
-        </w:rPr>
-        <w:t xml:space="preserve">همان مراحل فصل ۵ (Sysmon، Audit، Forwarder) روی DC هم انجام شود.</w:t>
-      </w:r>
-    </w:p>
-    <w:p>
-      <w:pPr>
-        <w:bidi/>
-        <w:spacing w:after="60"/>
-        <w:ind w:right="200"/>
-      </w:pPr>
-      <w:r>
-        <w:rPr>
-          <w:rFonts w:ascii="Segoe UI" w:cs="Tahoma" w:eastAsia="Segoe UI" w:hAnsi="Segoe UI"/>
-          <w:color w:val="0B6E79"/>
-        </w:rPr>
-        <w:t xml:space="preserve">☐  </w:t>
-      </w:r>
-      <w:r>
-        <w:rPr>
-          <w:rFonts w:ascii="Segoe UI" w:cs="Tahoma" w:eastAsia="Segoe UI" w:hAnsi="Segoe UI"/>
-          <w:rtl/>
-        </w:rPr>
-        <w:t xml:space="preserve">چند کاربر و گروه آزمایشی و یک حساب سرویس با SPN بسازید تا تست‌هایی مثل Kerberoasting معنی داشته باشند.</w:t>
-      </w:r>
-    </w:p>
-    <w:p>
-      <w:pPr>
-        <w:pStyle w:val="Heading2"/>
-        <w:bidi/>
-      </w:pPr>
-      <w:r>
-        <w:rPr>
-          <w:rFonts w:ascii="Segoe UI" w:cs="Tahoma" w:eastAsia="Segoe UI" w:hAnsi="Segoe UI"/>
-          <w:rtl/>
-        </w:rPr>
-        <w:t xml:space="preserve">LNX-VICTIM</w:t>
-      </w:r>
-    </w:p>
-    <w:p>
-      <w:pPr>
-        <w:bidi/>
-        <w:spacing w:after="60"/>
-        <w:ind w:right="200"/>
-      </w:pPr>
-      <w:r>
-        <w:rPr>
-          <w:rFonts w:ascii="Segoe UI" w:cs="Tahoma" w:eastAsia="Segoe UI" w:hAnsi="Segoe UI"/>
-          <w:color w:val="0B6E79"/>
-        </w:rPr>
-        <w:t xml:space="preserve">☐  </w:t>
-      </w:r>
-      <w:r>
-        <w:rPr>
-          <w:rFonts w:ascii="Segoe UI" w:cs="Tahoma" w:eastAsia="Segoe UI" w:hAnsi="Segoe UI"/>
-          <w:rtl/>
-        </w:rPr>
-        <w:t xml:space="preserve">نصب </w:t>
-      </w:r>
-      <w:r>
-        <w:rPr>
-          <w:rFonts w:ascii="Segoe UI" w:cs="Tahoma" w:eastAsia="Segoe UI" w:hAnsi="Segoe UI"/>
-          <w:b/>
-          <w:bCs/>
-          <w:rtl w:val="false"/>
-        </w:rPr>
-        <w:t xml:space="preserve">auditd</w:t>
-      </w:r>
-      <w:r>
-        <w:rPr>
-          <w:rFonts w:ascii="Segoe UI" w:cs="Tahoma" w:eastAsia="Segoe UI" w:hAnsi="Segoe UI"/>
-          <w:rtl/>
-        </w:rPr>
-        <w:t xml:space="preserve"> و </w:t>
-      </w:r>
-      <w:r>
-        <w:rPr>
-          <w:rFonts w:ascii="Segoe UI" w:cs="Tahoma" w:eastAsia="Segoe UI" w:hAnsi="Segoe UI"/>
-          <w:b/>
-          <w:bCs/>
-          <w:rtl w:val="false"/>
-        </w:rPr>
-        <w:t xml:space="preserve">Sysmon for Linux</w:t>
-      </w:r>
-      <w:r>
-        <w:rPr>
-          <w:rFonts w:ascii="Segoe UI" w:cs="Tahoma" w:eastAsia="Segoe UI" w:hAnsi="Segoe UI"/>
-          <w:rtl/>
-        </w:rPr>
-        <w:t xml:space="preserve"> (از مخزن بسته‌های Microsoft).</w:t>
-      </w:r>
-    </w:p>
-    <w:p>
-      <w:pPr>
-        <w:bidi/>
-        <w:spacing w:after="60"/>
-        <w:ind w:right="200"/>
-      </w:pPr>
-      <w:r>
-        <w:rPr>
-          <w:rFonts w:ascii="Segoe UI" w:cs="Tahoma" w:eastAsia="Segoe UI" w:hAnsi="Segoe UI"/>
-          <w:color w:val="0B6E79"/>
-        </w:rPr>
-        <w:t xml:space="preserve">☐  </w:t>
-      </w:r>
-      <w:r>
-        <w:rPr>
-          <w:rFonts w:ascii="Segoe UI" w:cs="Tahoma" w:eastAsia="Segoe UI" w:hAnsi="Segoe UI"/>
-          <w:rtl/>
-        </w:rPr>
-        <w:t xml:space="preserve">نصب Splunk Universal Forwarder برای لینوکس، فرستادن </w:t>
-      </w:r>
-      <w:r>
-        <w:rPr>
-          <w:rFonts w:ascii="Consolas" w:cs="Consolas" w:hAnsi="Consolas"/>
-          <w:color w:val="0B6E79"/>
-          <w:sz w:val="19"/>
-          <w:szCs w:val="19"/>
-          <w:rtl w:val="false"/>
-        </w:rPr>
-        <w:t xml:space="preserve">‎/var/log/audit/audit.log‎</w:t>
-      </w:r>
-      <w:r>
-        <w:rPr>
-          <w:rFonts w:ascii="Segoe UI" w:cs="Tahoma" w:eastAsia="Segoe UI" w:hAnsi="Segoe UI"/>
-          <w:rtl/>
-        </w:rPr>
-        <w:t xml:space="preserve">، </w:t>
-      </w:r>
-      <w:r>
-        <w:rPr>
-          <w:rFonts w:ascii="Consolas" w:cs="Consolas" w:hAnsi="Consolas"/>
-          <w:color w:val="0B6E79"/>
-          <w:sz w:val="19"/>
-          <w:szCs w:val="19"/>
-          <w:rtl w:val="false"/>
-        </w:rPr>
-        <w:t xml:space="preserve">‎/var/log/syslog‎</w:t>
-      </w:r>
-      <w:r>
-        <w:rPr>
-          <w:rFonts w:ascii="Segoe UI" w:cs="Tahoma" w:eastAsia="Segoe UI" w:hAnsi="Segoe UI"/>
-          <w:rtl/>
-        </w:rPr>
-        <w:t xml:space="preserve"> و لاگ Sysmon به index </w:t>
-      </w:r>
-      <w:r>
-        <w:rPr>
-          <w:rFonts w:ascii="Consolas" w:cs="Consolas" w:hAnsi="Consolas"/>
-          <w:color w:val="0B6E79"/>
-          <w:sz w:val="19"/>
-          <w:szCs w:val="19"/>
-          <w:rtl w:val="false"/>
-        </w:rPr>
-        <w:t xml:space="preserve">‎linux‎</w:t>
-      </w:r>
-      <w:r>
-        <w:rPr>
-          <w:rFonts w:ascii="Segoe UI" w:cs="Tahoma" w:eastAsia="Segoe UI" w:hAnsi="Segoe UI"/>
-          <w:rtl/>
-        </w:rPr>
-        <w:t xml:space="preserve">.</w:t>
-      </w:r>
-    </w:p>
-    <w:p>
-      <w:pPr>
-        <w:bidi/>
-        <w:spacing w:after="60"/>
-        <w:ind w:right="200"/>
-      </w:pPr>
-      <w:r>
-        <w:rPr>
-          <w:rFonts w:ascii="Segoe UI" w:cs="Tahoma" w:eastAsia="Segoe UI" w:hAnsi="Segoe UI"/>
-          <w:color w:val="0B6E79"/>
-        </w:rPr>
-        <w:t xml:space="preserve">☐  </w:t>
-      </w:r>
-      <w:r>
-        <w:rPr>
-          <w:rFonts w:ascii="Segoe UI" w:cs="Tahoma" w:eastAsia="Segoe UI" w:hAnsi="Segoe UI"/>
-          <w:rtl/>
-        </w:rPr>
-        <w:t xml:space="preserve">نصب </w:t>
-      </w:r>
-      <w:r>
-        <w:rPr>
-          <w:rFonts w:ascii="Segoe UI" w:cs="Tahoma" w:eastAsia="Segoe UI" w:hAnsi="Segoe UI"/>
-          <w:b/>
-          <w:bCs/>
-          <w:rtl w:val="false"/>
-        </w:rPr>
-        <w:t xml:space="preserve">PowerShell 7</w:t>
-      </w:r>
-      <w:r>
-        <w:rPr>
-          <w:rFonts w:ascii="Segoe UI" w:cs="Tahoma" w:eastAsia="Segoe UI" w:hAnsi="Segoe UI"/>
-          <w:rtl/>
-        </w:rPr>
-        <w:t xml:space="preserve"> (</w:t>
-      </w:r>
-      <w:r>
-        <w:rPr>
-          <w:rFonts w:ascii="Consolas" w:cs="Consolas" w:hAnsi="Consolas"/>
-          <w:color w:val="0B6E79"/>
-          <w:sz w:val="19"/>
-          <w:szCs w:val="19"/>
-          <w:rtl w:val="false"/>
-        </w:rPr>
-        <w:t xml:space="preserve">‎pwsh‎</w:t>
-      </w:r>
-      <w:r>
-        <w:rPr>
-          <w:rFonts w:ascii="Segoe UI" w:cs="Tahoma" w:eastAsia="Segoe UI" w:hAnsi="Segoe UI"/>
-          <w:rtl/>
-        </w:rPr>
-        <w:t xml:space="preserve">) تا Invoke-AtomicRedTeam روی لینوکس هم کار کند.</w:t>
-      </w:r>
-    </w:p>
-    <w:p>
-      <w:pPr>
-        <w:pStyle w:val="Heading1"/>
-        <w:pageBreakBefore/>
-        <w:bidi/>
-      </w:pPr>
-      <w:r>
-        <w:rPr>
-          <w:rFonts w:ascii="Segoe UI" w:cs="Tahoma" w:eastAsia="Segoe UI" w:hAnsi="Segoe UI"/>
-          <w:rtl/>
-        </w:rPr>
-        <w:t xml:space="preserve">۷. نصب Atomic Red Team و اجرای اولین تست</w:t>
-      </w:r>
-    </w:p>
-    <w:p>
-      <w:pPr>
-        <w:pStyle w:val="Heading2"/>
-        <w:bidi/>
-      </w:pPr>
-      <w:r>
-        <w:rPr>
-          <w:rFonts w:ascii="Segoe UI" w:cs="Tahoma" w:eastAsia="Segoe UI" w:hAnsi="Segoe UI"/>
-          <w:rtl/>
-        </w:rPr>
-        <w:t xml:space="preserve">۷-۱. نصب روی WIN-VICTIM</w:t>
-      </w:r>
-    </w:p>
-    <w:tbl>
-      <w:tblPr>
-        <w:tblW w:type="dxa" w:w="9638"/>
-        <w:tblBorders>
-          <w:top w:val="single" w:color="auto" w:sz="4"/>
-          <w:left w:val="single" w:color="auto" w:sz="4"/>
-          <w:bottom w:val="single" w:color="auto" w:sz="4"/>
-          <w:right w:val="single" w:color="auto" w:sz="4"/>
-          <w:insideH w:val="single" w:color="auto" w:sz="4"/>
-          <w:insideV w:val="single" w:color="auto" w:sz="4"/>
-        </w:tblBorders>
-      </w:tblPr>
-      <w:tblGrid>
-        <w:gridCol w:w="9638"/>
-      </w:tblGrid>
-      <w:tr>
-        <w:tc>
-          <w:tcPr>
-            <w:tcW w:type="dxa" w:w="9638"/>
-            <w:tcBorders>
-              <w:top w:val="single" w:color="D5DCE4" w:sz="4"/>
-              <w:left w:val="single" w:color="0B6E79" w:sz="16"/>
-              <w:bottom w:val="single" w:color="D5DCE4" w:sz="4"/>
-              <w:right w:val="single" w:color="D5DCE4" w:sz="4"/>
-            </w:tcBorders>
-            <w:shd w:fill="F3F5F8" w:color="auto" w:val="clear"/>
-            <w:tcMar>
-              <w:top w:type="dxa" w:w="100"/>
-              <w:left w:type="dxa" w:w="160"/>
-              <w:bottom w:type="dxa" w:w="100"/>
-              <w:right w:type="dxa" w:w="160"/>
-            </w:tcMar>
-          </w:tcPr>
-          <w:p>
-            <w:pPr>
-              <w:spacing w:after="0" w:line="260" w:lineRule="auto"/>
-              <w:jc w:val="left"/>
-            </w:pPr>
-            <w:r>
-              <w:rPr>
-                <w:rFonts w:ascii="Consolas" w:cs="Consolas" w:hAnsi="Consolas"/>
-                <w:color w:val="1B2533"/>
-                <w:sz w:val="17"/>
-                <w:szCs w:val="17"/>
-              </w:rPr>
-              <w:t xml:space="preserve">Set-ExecutionPolicy Bypass -Scope Process -Force</w:t>
-            </w:r>
-          </w:p>
-          <w:p>
-            <w:pPr>
-              <w:spacing w:after="0" w:line="260" w:lineRule="auto"/>
-              <w:jc w:val="left"/>
-            </w:pPr>
-            <w:r>
-              <w:rPr>
-                <w:rFonts w:ascii="Consolas" w:cs="Consolas" w:hAnsi="Consolas"/>
-                <w:color w:val="1B2533"/>
-                <w:sz w:val="17"/>
-                <w:szCs w:val="17"/>
-              </w:rPr>
-              <w:t xml:space="preserve">IEX (IWR 'https://raw.githubusercontent.com/redcanaryco/invoke-atomicredteam/master/install-atomicredteam.ps1' -UseBasicParsing)</w:t>
-            </w:r>
-          </w:p>
-          <w:p>
-            <w:pPr>
-              <w:spacing w:after="0" w:line="260" w:lineRule="auto"/>
-              <w:jc w:val="left"/>
-            </w:pPr>
-            <w:r>
-              <w:rPr>
-                <w:rFonts w:ascii="Consolas" w:cs="Consolas" w:hAnsi="Consolas"/>
-                <w:color w:val="1B2533"/>
-                <w:sz w:val="17"/>
-                <w:szCs w:val="17"/>
-              </w:rPr>
-              <w:t xml:space="preserve">Install-AtomicRedTeam -getAtomics -Force</w:t>
+              <w:t xml:space="preserve">reg add "HKLM\SOFTWARE\Policies\Microsoft\Windows\PowerShell\ModuleLogging\ModuleNames" /v "*" /t REG_SZ /d "*" /f</w:t>
             </w:r>
           </w:p>
         </w:tc>
@@ -7548,7 +6513,7 @@
                 <w:color w:val="0B6E79"/>
                 <w:rtl/>
               </w:rPr>
-              <w:t xml:space="preserve">بدون اینترنت</w:t>
+              <w:t xml:space="preserve">برای DC</w:t>
             </w:r>
           </w:p>
           <w:p>
@@ -7562,7 +6527,7 @@
                 <w:rFonts w:ascii="Segoe UI" w:cs="Tahoma" w:eastAsia="Segoe UI" w:hAnsi="Segoe UI"/>
                 <w:rtl/>
               </w:rPr>
-              <w:t xml:space="preserve">اگر ماشین اینترنت ندارد: دو مخزن </w:t>
+              <w:t xml:space="preserve">روی DC-LAB علاوه بر این‌ها </w:t>
             </w:r>
             <w:r>
               <w:rPr>
@@ -7572,14 +6537,14 @@
                 <w:szCs w:val="19"/>
                 <w:rtl w:val="false"/>
               </w:rPr>
-              <w:t xml:space="preserve">‎redcanaryco/invoke-atomicredteam‎</w:t>
-            </w:r>
-            <w:r>
-              <w:rPr>
-                <w:rFonts w:ascii="Segoe UI" w:cs="Tahoma" w:eastAsia="Segoe UI" w:hAnsi="Segoe UI"/>
-                <w:rtl/>
-              </w:rPr>
-              <w:t xml:space="preserve"> و </w:t>
+              <w:t xml:space="preserve">‎Kerberos Service Ticket Operations‎</w:t>
+            </w:r>
+            <w:r>
+              <w:rPr>
+                <w:rFonts w:ascii="Segoe UI" w:cs="Tahoma" w:eastAsia="Segoe UI" w:hAnsi="Segoe UI"/>
+                <w:rtl/>
+              </w:rPr>
+              <w:t xml:space="preserve">، </w:t>
             </w:r>
             <w:r>
               <w:rPr>
@@ -7589,14 +6554,14 @@
                 <w:szCs w:val="19"/>
                 <w:rtl w:val="false"/>
               </w:rPr>
-              <w:t xml:space="preserve">‎redcanaryco/atomic-red-team‎</w:t>
-            </w:r>
-            <w:r>
-              <w:rPr>
-                <w:rFonts w:ascii="Segoe UI" w:cs="Tahoma" w:eastAsia="Segoe UI" w:hAnsi="Segoe UI"/>
-                <w:rtl/>
-              </w:rPr>
-              <w:t xml:space="preserve"> را جای دیگری به‌صورت ZIP دانلود کنید، در </w:t>
+              <w:t xml:space="preserve">‎Kerberos Authentication Service‎</w:t>
+            </w:r>
+            <w:r>
+              <w:rPr>
+                <w:rFonts w:ascii="Segoe UI" w:cs="Tahoma" w:eastAsia="Segoe UI" w:hAnsi="Segoe UI"/>
+                <w:rtl/>
+              </w:rPr>
+              <w:t xml:space="preserve"> و </w:t>
             </w:r>
             <w:r>
               <w:rPr>
@@ -7606,31 +6571,14 @@
                 <w:szCs w:val="19"/>
                 <w:rtl w:val="false"/>
               </w:rPr>
-              <w:t xml:space="preserve">‎C:\AtomicRedTeam‎</w:t>
-            </w:r>
-            <w:r>
-              <w:rPr>
-                <w:rFonts w:ascii="Segoe UI" w:cs="Tahoma" w:eastAsia="Segoe UI" w:hAnsi="Segoe UI"/>
-                <w:rtl/>
-              </w:rPr>
-              <w:t xml:space="preserve"> باز کنید و ماژول </w:t>
-            </w:r>
-            <w:r>
-              <w:rPr>
-                <w:rFonts w:ascii="Consolas" w:cs="Consolas" w:hAnsi="Consolas"/>
-                <w:color w:val="0B6E79"/>
-                <w:sz w:val="19"/>
-                <w:szCs w:val="19"/>
-                <w:rtl w:val="false"/>
-              </w:rPr>
-              <w:t xml:space="preserve">‎powershell-yaml‎</w:t>
-            </w:r>
-            <w:r>
-              <w:rPr>
-                <w:rFonts w:ascii="Segoe UI" w:cs="Tahoma" w:eastAsia="Segoe UI" w:hAnsi="Segoe UI"/>
-                <w:rtl/>
-              </w:rPr>
-              <w:t xml:space="preserve"> را هم نصب کنید.</w:t>
+              <w:t xml:space="preserve">‎Directory Service Changes‎</w:t>
+            </w:r>
+            <w:r>
+              <w:rPr>
+                <w:rFonts w:ascii="Segoe UI" w:cs="Tahoma" w:eastAsia="Segoe UI" w:hAnsi="Segoe UI"/>
+                <w:rtl/>
+              </w:rPr>
+              <w:t xml:space="preserve"> را هم فعال کنید (برای 4769، 4768 و 5136).</w:t>
             </w:r>
           </w:p>
         </w:tc>
@@ -7651,70 +6599,7 @@
           <w:rFonts w:ascii="Segoe UI" w:cs="Tahoma" w:eastAsia="Segoe UI" w:hAnsi="Segoe UI"/>
           <w:rtl/>
         </w:rPr>
-        <w:t xml:space="preserve">۷-۲. اجرای یک تست</w:t>
-      </w:r>
-    </w:p>
-    <w:p>
-      <w:pPr>
-        <w:bidi/>
-        <w:spacing w:after="120"/>
-        <w:jc w:val="both"/>
-      </w:pPr>
-      <w:r>
-        <w:rPr>
-          <w:rFonts w:ascii="Segoe UI" w:cs="Tahoma" w:eastAsia="Segoe UI" w:hAnsi="Segoe UI"/>
-          <w:rtl/>
-        </w:rPr>
-        <w:t xml:space="preserve">در DetectKB، صفحه‌ی </w:t>
-      </w:r>
-      <w:r>
-        <w:rPr>
-          <w:rFonts w:ascii="Segoe UI" w:cs="Tahoma" w:eastAsia="Segoe UI" w:hAnsi="Segoe UI"/>
-          <w:b/>
-          <w:bCs/>
-          <w:rtl w:val="false"/>
-        </w:rPr>
-        <w:t xml:space="preserve">Atomic Red Team</w:t>
-      </w:r>
-      <w:r>
-        <w:rPr>
-          <w:rFonts w:ascii="Segoe UI" w:cs="Tahoma" w:eastAsia="Segoe UI" w:hAnsi="Segoe UI"/>
-          <w:rtl/>
-        </w:rPr>
-        <w:t xml:space="preserve"> یا بخش </w:t>
-      </w:r>
-      <w:r>
-        <w:rPr>
-          <w:rFonts w:ascii="Segoe UI" w:cs="Tahoma" w:eastAsia="Segoe UI" w:hAnsi="Segoe UI"/>
-          <w:b/>
-          <w:bCs/>
-          <w:rtl w:val="false"/>
-        </w:rPr>
-        <w:t xml:space="preserve">Atomic Red Team tests</w:t>
-      </w:r>
-      <w:r>
-        <w:rPr>
-          <w:rFonts w:ascii="Segoe UI" w:cs="Tahoma" w:eastAsia="Segoe UI" w:hAnsi="Segoe UI"/>
-          <w:rtl/>
-        </w:rPr>
-        <w:t xml:space="preserve"> صفحه‌ی قانون را باز کنید و خط </w:t>
-      </w:r>
-      <w:r>
-        <w:rPr>
-          <w:rFonts w:ascii="Consolas" w:cs="Consolas" w:hAnsi="Consolas"/>
-          <w:color w:val="0B6E79"/>
-          <w:sz w:val="19"/>
-          <w:szCs w:val="19"/>
-          <w:rtl w:val="false"/>
-        </w:rPr>
-        <w:t xml:space="preserve">‎Invoke-AtomicTest‎</w:t>
-      </w:r>
-      <w:r>
-        <w:rPr>
-          <w:rFonts w:ascii="Segoe UI" w:cs="Tahoma" w:eastAsia="Segoe UI" w:hAnsi="Segoe UI"/>
-          <w:rtl/>
-        </w:rPr>
-        <w:t xml:space="preserve"> را کپی کنید. روی WIN-VICTIM:</w:t>
+        <w:t xml:space="preserve">۵-۳. Splunk Universal Forwarder</w:t>
       </w:r>
     </w:p>
     <w:tbl>
@@ -7762,9 +6647,81 @@
                 <w:sz w:val="17"/>
                 <w:szCs w:val="17"/>
               </w:rPr>
-              <w:t xml:space="preserve">Import-Module 'C:\AtomicRedTeam\invoke-atomicredteam\Invoke-AtomicRedTeam.psd1' -Force</w:t>
-            </w:r>
-          </w:p>
+              <w:t xml:space="preserve">msiexec.exe /i splunkforwarder-&lt;version&gt;-x64-release.msi AGREETOLICENSE=Yes RECEIVING_INDEXER="10.50.0.10:9997" SPLUNKUSERNAME=admin SPLUNKPASSWORD="CHANGE-ME-UF" /quiet</w:t>
+            </w:r>
+          </w:p>
+        </w:tc>
+      </w:tr>
+    </w:tbl>
+    <w:p>
+      <w:pPr>
+        <w:spacing w:after="140"/>
+      </w:pPr>
+    </w:p>
+    <w:p>
+      <w:pPr>
+        <w:bidi/>
+        <w:spacing w:after="120"/>
+        <w:jc w:val="both"/>
+      </w:pPr>
+      <w:r>
+        <w:rPr>
+          <w:rFonts w:ascii="Segoe UI" w:cs="Tahoma" w:eastAsia="Segoe UI" w:hAnsi="Segoe UI"/>
+          <w:rtl/>
+        </w:rPr>
+        <w:t xml:space="preserve">سپس فایل </w:t>
+      </w:r>
+      <w:r>
+        <w:rPr>
+          <w:rFonts w:ascii="Consolas" w:cs="Consolas" w:hAnsi="Consolas"/>
+          <w:color w:val="0B6E79"/>
+          <w:sz w:val="19"/>
+          <w:szCs w:val="19"/>
+          <w:rtl w:val="false"/>
+        </w:rPr>
+        <w:t xml:space="preserve">‎C:\Program Files\SplunkUniversalForwarder\etc\system\local\inputs.conf‎</w:t>
+      </w:r>
+      <w:r>
+        <w:rPr>
+          <w:rFonts w:ascii="Segoe UI" w:cs="Tahoma" w:eastAsia="Segoe UI" w:hAnsi="Segoe UI"/>
+          <w:rtl/>
+        </w:rPr>
+        <w:t xml:space="preserve"> را با این محتوا بسازید و سرویس SplunkForwarder را ری‌استارت کنید:</w:t>
+      </w:r>
+    </w:p>
+    <w:tbl>
+      <w:tblPr>
+        <w:tblW w:type="dxa" w:w="9638"/>
+        <w:tblBorders>
+          <w:top w:val="single" w:color="auto" w:sz="4"/>
+          <w:left w:val="single" w:color="auto" w:sz="4"/>
+          <w:bottom w:val="single" w:color="auto" w:sz="4"/>
+          <w:right w:val="single" w:color="auto" w:sz="4"/>
+          <w:insideH w:val="single" w:color="auto" w:sz="4"/>
+          <w:insideV w:val="single" w:color="auto" w:sz="4"/>
+        </w:tblBorders>
+      </w:tblPr>
+      <w:tblGrid>
+        <w:gridCol w:w="9638"/>
+      </w:tblGrid>
+      <w:tr>
+        <w:tc>
+          <w:tcPr>
+            <w:tcW w:type="dxa" w:w="9638"/>
+            <w:tcBorders>
+              <w:top w:val="single" w:color="D5DCE4" w:sz="4"/>
+              <w:left w:val="single" w:color="0B6E79" w:sz="16"/>
+              <w:bottom w:val="single" w:color="D5DCE4" w:sz="4"/>
+              <w:right w:val="single" w:color="D5DCE4" w:sz="4"/>
+            </w:tcBorders>
+            <w:shd w:fill="F3F5F8" w:color="auto" w:val="clear"/>
+            <w:tcMar>
+              <w:top w:type="dxa" w:w="100"/>
+              <w:left w:type="dxa" w:w="160"/>
+              <w:bottom w:type="dxa" w:w="100"/>
+              <w:right w:type="dxa" w:w="160"/>
+            </w:tcMar>
+          </w:tcPr>
           <w:p>
             <w:pPr>
               <w:spacing w:after="0" w:line="260" w:lineRule="auto"/>
@@ -7777,7 +6734,7 @@
                 <w:sz w:val="17"/>
                 <w:szCs w:val="17"/>
               </w:rPr>
-              <w:t xml:space="preserve"> </w:t>
+              <w:t xml:space="preserve">[WinEventLog://Security]</w:t>
             </w:r>
           </w:p>
           <w:p>
@@ -7792,7 +6749,7 @@
                 <w:sz w:val="17"/>
                 <w:szCs w:val="17"/>
               </w:rPr>
-              <w:t xml:space="preserve"># 1. Prerequisites (downloads the test's tools)</w:t>
+              <w:t xml:space="preserve">disabled = 0</w:t>
             </w:r>
           </w:p>
           <w:p>
@@ -7807,7 +6764,7 @@
                 <w:sz w:val="17"/>
                 <w:szCs w:val="17"/>
               </w:rPr>
-              <w:t xml:space="preserve">Invoke-AtomicTest T1003.001 -TestGuids 2536dee2-12fb-459a-8c37-971844fa73be -GetPrereqs</w:t>
+              <w:t xml:space="preserve">renderXml = true</w:t>
             </w:r>
           </w:p>
           <w:p>
@@ -7822,7 +6779,7 @@
                 <w:sz w:val="17"/>
                 <w:szCs w:val="17"/>
               </w:rPr>
-              <w:t xml:space="preserve"> </w:t>
+              <w:t xml:space="preserve">index = win</w:t>
             </w:r>
           </w:p>
           <w:p>
@@ -7837,7 +6794,7 @@
                 <w:sz w:val="17"/>
                 <w:szCs w:val="17"/>
               </w:rPr>
-              <w:t xml:space="preserve"># 2. Run the attack</w:t>
+              <w:t xml:space="preserve"> </w:t>
             </w:r>
           </w:p>
           <w:p>
@@ -7852,7 +6809,7 @@
                 <w:sz w:val="17"/>
                 <w:szCs w:val="17"/>
               </w:rPr>
-              <w:t xml:space="preserve">Invoke-AtomicTest T1003.001 -TestGuids 2536dee2-12fb-459a-8c37-971844fa73be</w:t>
+              <w:t xml:space="preserve">[WinEventLog://System]</w:t>
             </w:r>
           </w:p>
           <w:p>
@@ -7867,7 +6824,7 @@
                 <w:sz w:val="17"/>
                 <w:szCs w:val="17"/>
               </w:rPr>
-              <w:t xml:space="preserve"> </w:t>
+              <w:t xml:space="preserve">disabled = 0</w:t>
             </w:r>
           </w:p>
           <w:p>
@@ -7882,7 +6839,7 @@
                 <w:sz w:val="17"/>
                 <w:szCs w:val="17"/>
               </w:rPr>
-              <w:t xml:space="preserve"># 3. Clean up</w:t>
+              <w:t xml:space="preserve">renderXml = true</w:t>
             </w:r>
           </w:p>
           <w:p>
@@ -7897,7 +6854,232 @@
                 <w:sz w:val="17"/>
                 <w:szCs w:val="17"/>
               </w:rPr>
-              <w:t xml:space="preserve">Invoke-AtomicTest T1003.001 -TestGuids 2536dee2-12fb-459a-8c37-971844fa73be -Cleanup</w:t>
+              <w:t xml:space="preserve">index = win</w:t>
+            </w:r>
+          </w:p>
+          <w:p>
+            <w:pPr>
+              <w:spacing w:after="0" w:line="260" w:lineRule="auto"/>
+              <w:jc w:val="left"/>
+            </w:pPr>
+            <w:r>
+              <w:rPr>
+                <w:rFonts w:ascii="Consolas" w:cs="Consolas" w:hAnsi="Consolas"/>
+                <w:color w:val="1B2533"/>
+                <w:sz w:val="17"/>
+                <w:szCs w:val="17"/>
+              </w:rPr>
+              <w:t xml:space="preserve"> </w:t>
+            </w:r>
+          </w:p>
+          <w:p>
+            <w:pPr>
+              <w:spacing w:after="0" w:line="260" w:lineRule="auto"/>
+              <w:jc w:val="left"/>
+            </w:pPr>
+            <w:r>
+              <w:rPr>
+                <w:rFonts w:ascii="Consolas" w:cs="Consolas" w:hAnsi="Consolas"/>
+                <w:color w:val="1B2533"/>
+                <w:sz w:val="17"/>
+                <w:szCs w:val="17"/>
+              </w:rPr>
+              <w:t xml:space="preserve">[WinEventLog://Microsoft-Windows-PowerShell/Operational]</w:t>
+            </w:r>
+          </w:p>
+          <w:p>
+            <w:pPr>
+              <w:spacing w:after="0" w:line="260" w:lineRule="auto"/>
+              <w:jc w:val="left"/>
+            </w:pPr>
+            <w:r>
+              <w:rPr>
+                <w:rFonts w:ascii="Consolas" w:cs="Consolas" w:hAnsi="Consolas"/>
+                <w:color w:val="1B2533"/>
+                <w:sz w:val="17"/>
+                <w:szCs w:val="17"/>
+              </w:rPr>
+              <w:t xml:space="preserve">disabled = 0</w:t>
+            </w:r>
+          </w:p>
+          <w:p>
+            <w:pPr>
+              <w:spacing w:after="0" w:line="260" w:lineRule="auto"/>
+              <w:jc w:val="left"/>
+            </w:pPr>
+            <w:r>
+              <w:rPr>
+                <w:rFonts w:ascii="Consolas" w:cs="Consolas" w:hAnsi="Consolas"/>
+                <w:color w:val="1B2533"/>
+                <w:sz w:val="17"/>
+                <w:szCs w:val="17"/>
+              </w:rPr>
+              <w:t xml:space="preserve">renderXml = true</w:t>
+            </w:r>
+          </w:p>
+          <w:p>
+            <w:pPr>
+              <w:spacing w:after="0" w:line="260" w:lineRule="auto"/>
+              <w:jc w:val="left"/>
+            </w:pPr>
+            <w:r>
+              <w:rPr>
+                <w:rFonts w:ascii="Consolas" w:cs="Consolas" w:hAnsi="Consolas"/>
+                <w:color w:val="1B2533"/>
+                <w:sz w:val="17"/>
+                <w:szCs w:val="17"/>
+              </w:rPr>
+              <w:t xml:space="preserve">index = win</w:t>
+            </w:r>
+          </w:p>
+          <w:p>
+            <w:pPr>
+              <w:spacing w:after="0" w:line="260" w:lineRule="auto"/>
+              <w:jc w:val="left"/>
+            </w:pPr>
+            <w:r>
+              <w:rPr>
+                <w:rFonts w:ascii="Consolas" w:cs="Consolas" w:hAnsi="Consolas"/>
+                <w:color w:val="1B2533"/>
+                <w:sz w:val="17"/>
+                <w:szCs w:val="17"/>
+              </w:rPr>
+              <w:t xml:space="preserve"> </w:t>
+            </w:r>
+          </w:p>
+          <w:p>
+            <w:pPr>
+              <w:spacing w:after="0" w:line="260" w:lineRule="auto"/>
+              <w:jc w:val="left"/>
+            </w:pPr>
+            <w:r>
+              <w:rPr>
+                <w:rFonts w:ascii="Consolas" w:cs="Consolas" w:hAnsi="Consolas"/>
+                <w:color w:val="1B2533"/>
+                <w:sz w:val="17"/>
+                <w:szCs w:val="17"/>
+              </w:rPr>
+              <w:t xml:space="preserve">[WinEventLog://Microsoft-Windows-Sysmon/Operational]</w:t>
+            </w:r>
+          </w:p>
+          <w:p>
+            <w:pPr>
+              <w:spacing w:after="0" w:line="260" w:lineRule="auto"/>
+              <w:jc w:val="left"/>
+            </w:pPr>
+            <w:r>
+              <w:rPr>
+                <w:rFonts w:ascii="Consolas" w:cs="Consolas" w:hAnsi="Consolas"/>
+                <w:color w:val="1B2533"/>
+                <w:sz w:val="17"/>
+                <w:szCs w:val="17"/>
+              </w:rPr>
+              <w:t xml:space="preserve">disabled = 0</w:t>
+            </w:r>
+          </w:p>
+          <w:p>
+            <w:pPr>
+              <w:spacing w:after="0" w:line="260" w:lineRule="auto"/>
+              <w:jc w:val="left"/>
+            </w:pPr>
+            <w:r>
+              <w:rPr>
+                <w:rFonts w:ascii="Consolas" w:cs="Consolas" w:hAnsi="Consolas"/>
+                <w:color w:val="1B2533"/>
+                <w:sz w:val="17"/>
+                <w:szCs w:val="17"/>
+              </w:rPr>
+              <w:t xml:space="preserve">renderXml = true</w:t>
+            </w:r>
+          </w:p>
+          <w:p>
+            <w:pPr>
+              <w:spacing w:after="0" w:line="260" w:lineRule="auto"/>
+              <w:jc w:val="left"/>
+            </w:pPr>
+            <w:r>
+              <w:rPr>
+                <w:rFonts w:ascii="Consolas" w:cs="Consolas" w:hAnsi="Consolas"/>
+                <w:color w:val="1B2533"/>
+                <w:sz w:val="17"/>
+                <w:szCs w:val="17"/>
+              </w:rPr>
+              <w:t xml:space="preserve">index = sysmon</w:t>
+            </w:r>
+          </w:p>
+          <w:p>
+            <w:pPr>
+              <w:spacing w:after="0" w:line="260" w:lineRule="auto"/>
+              <w:jc w:val="left"/>
+            </w:pPr>
+            <w:r>
+              <w:rPr>
+                <w:rFonts w:ascii="Consolas" w:cs="Consolas" w:hAnsi="Consolas"/>
+                <w:color w:val="1B2533"/>
+                <w:sz w:val="17"/>
+                <w:szCs w:val="17"/>
+              </w:rPr>
+              <w:t xml:space="preserve"> </w:t>
+            </w:r>
+          </w:p>
+          <w:p>
+            <w:pPr>
+              <w:spacing w:after="0" w:line="260" w:lineRule="auto"/>
+              <w:jc w:val="left"/>
+            </w:pPr>
+            <w:r>
+              <w:rPr>
+                <w:rFonts w:ascii="Consolas" w:cs="Consolas" w:hAnsi="Consolas"/>
+                <w:color w:val="1B2533"/>
+                <w:sz w:val="17"/>
+                <w:szCs w:val="17"/>
+              </w:rPr>
+              <w:t xml:space="preserve">[WinEventLog://Microsoft-Windows-TaskScheduler/Operational]</w:t>
+            </w:r>
+          </w:p>
+          <w:p>
+            <w:pPr>
+              <w:spacing w:after="0" w:line="260" w:lineRule="auto"/>
+              <w:jc w:val="left"/>
+            </w:pPr>
+            <w:r>
+              <w:rPr>
+                <w:rFonts w:ascii="Consolas" w:cs="Consolas" w:hAnsi="Consolas"/>
+                <w:color w:val="1B2533"/>
+                <w:sz w:val="17"/>
+                <w:szCs w:val="17"/>
+              </w:rPr>
+              <w:t xml:space="preserve">disabled = 0</w:t>
+            </w:r>
+          </w:p>
+          <w:p>
+            <w:pPr>
+              <w:spacing w:after="0" w:line="260" w:lineRule="auto"/>
+              <w:jc w:val="left"/>
+            </w:pPr>
+            <w:r>
+              <w:rPr>
+                <w:rFonts w:ascii="Consolas" w:cs="Consolas" w:hAnsi="Consolas"/>
+                <w:color w:val="1B2533"/>
+                <w:sz w:val="17"/>
+                <w:szCs w:val="17"/>
+              </w:rPr>
+              <w:t xml:space="preserve">renderXml = true</w:t>
+            </w:r>
+          </w:p>
+          <w:p>
+            <w:pPr>
+              <w:spacing w:after="0" w:line="260" w:lineRule="auto"/>
+              <w:jc w:val="left"/>
+            </w:pPr>
+            <w:r>
+              <w:rPr>
+                <w:rFonts w:ascii="Consolas" w:cs="Consolas" w:hAnsi="Consolas"/>
+                <w:color w:val="1B2533"/>
+                <w:sz w:val="17"/>
+                <w:szCs w:val="17"/>
+              </w:rPr>
+              <w:t xml:space="preserve">index = win</w:t>
             </w:r>
           </w:p>
         </w:tc>
@@ -7908,6 +7090,62 @@
         <w:spacing w:after="140"/>
       </w:pPr>
     </w:p>
+    <w:tbl>
+      <w:tblPr>
+        <w:tblW w:type="dxa" w:w="9638"/>
+        <w:tblBorders>
+          <w:top w:val="single" w:color="auto" w:sz="4"/>
+          <w:left w:val="single" w:color="auto" w:sz="4"/>
+          <w:bottom w:val="single" w:color="auto" w:sz="4"/>
+          <w:right w:val="single" w:color="auto" w:sz="4"/>
+          <w:insideH w:val="single" w:color="auto" w:sz="4"/>
+          <w:insideV w:val="single" w:color="auto" w:sz="4"/>
+        </w:tblBorders>
+      </w:tblPr>
+      <w:tblGrid>
+        <w:gridCol w:w="9638"/>
+      </w:tblGrid>
+      <w:tr>
+        <w:tc>
+          <w:tcPr>
+            <w:tcW w:type="dxa" w:w="9638"/>
+            <w:tcBorders>
+              <w:top w:val="single" w:color="D5DCE4" w:sz="4"/>
+              <w:left w:val="single" w:color="0B6E79" w:sz="16"/>
+              <w:bottom w:val="single" w:color="D5DCE4" w:sz="4"/>
+              <w:right w:val="single" w:color="D5DCE4" w:sz="4"/>
+            </w:tcBorders>
+            <w:shd w:fill="F3F5F8" w:color="auto" w:val="clear"/>
+            <w:tcMar>
+              <w:top w:type="dxa" w:w="100"/>
+              <w:left w:type="dxa" w:w="160"/>
+              <w:bottom w:type="dxa" w:w="100"/>
+              <w:right w:type="dxa" w:w="160"/>
+            </w:tcMar>
+          </w:tcPr>
+          <w:p>
+            <w:pPr>
+              <w:spacing w:after="0" w:line="260" w:lineRule="auto"/>
+              <w:jc w:val="left"/>
+            </w:pPr>
+            <w:r>
+              <w:rPr>
+                <w:rFonts w:ascii="Consolas" w:cs="Consolas" w:hAnsi="Consolas"/>
+                <w:color w:val="1B2533"/>
+                <w:sz w:val="17"/>
+                <w:szCs w:val="17"/>
+              </w:rPr>
+              <w:t xml:space="preserve">Restart-Service SplunkForwarder</w:t>
+            </w:r>
+          </w:p>
+        </w:tc>
+      </w:tr>
+    </w:tbl>
+    <w:p>
+      <w:pPr>
+        <w:spacing w:after="140"/>
+      </w:pPr>
+    </w:p>
     <w:p>
       <w:pPr>
         <w:pStyle w:val="Heading2"/>
@@ -7918,7 +7156,1037 @@
           <w:rFonts w:ascii="Segoe UI" w:cs="Tahoma" w:eastAsia="Segoe UI" w:hAnsi="Segoe UI"/>
           <w:rtl/>
         </w:rPr>
-        <w:t xml:space="preserve">۷-۳. دیدن نتیجه</w:t>
+        <w:t xml:space="preserve">۵-۴. آنتی‌ویروس (Defender)</w:t>
+      </w:r>
+    </w:p>
+    <w:p>
+      <w:pPr>
+        <w:bidi/>
+        <w:spacing w:after="120"/>
+        <w:jc w:val="both"/>
+      </w:pPr>
+      <w:r>
+        <w:rPr>
+          <w:rFonts w:ascii="Segoe UI" w:cs="Tahoma" w:eastAsia="Segoe UI" w:hAnsi="Segoe UI"/>
+          <w:rtl/>
+        </w:rPr>
+        <w:t xml:space="preserve">خیلی از تست‌های Atomic را Defender قبل از اجرا متوقف می‌کند. دو حالت هر دو مفیدند، ولی باید مشخص باشد در کدام حالت تست کرده‌اید:</w:t>
+      </w:r>
+    </w:p>
+    <w:p>
+      <w:pPr>
+        <w:pStyle w:val="ListParagraph"/>
+        <w:numPr>
+          <w:ilvl w:val="0"/>
+          <w:numId w:val="2"/>
+        </w:numPr>
+        <w:bidi/>
+        <w:spacing w:after="60"/>
+      </w:pPr>
+      <w:r>
+        <w:rPr>
+          <w:rFonts w:ascii="Segoe UI" w:cs="Tahoma" w:eastAsia="Segoe UI" w:hAnsi="Segoe UI"/>
+          <w:b/>
+          <w:bCs/>
+          <w:rtl/>
+        </w:rPr>
+        <w:t xml:space="preserve">حالت تست قانون (پیشنهادی برای شروع):</w:t>
+      </w:r>
+      <w:r>
+        <w:rPr>
+          <w:rFonts w:ascii="Segoe UI" w:cs="Tahoma" w:eastAsia="Segoe UI" w:hAnsi="Segoe UI"/>
+          <w:rtl/>
+        </w:rPr>
+        <w:t xml:space="preserve"> برای پوشه‌ی </w:t>
+      </w:r>
+      <w:r>
+        <w:rPr>
+          <w:rFonts w:ascii="Consolas" w:cs="Consolas" w:hAnsi="Consolas"/>
+          <w:color w:val="0B6E79"/>
+          <w:sz w:val="19"/>
+          <w:szCs w:val="19"/>
+          <w:rtl w:val="false"/>
+        </w:rPr>
+        <w:t xml:space="preserve">‎C:\AtomicRedTeam‎</w:t>
+      </w:r>
+      <w:r>
+        <w:rPr>
+          <w:rFonts w:ascii="Segoe UI" w:cs="Tahoma" w:eastAsia="Segoe UI" w:hAnsi="Segoe UI"/>
+          <w:rtl/>
+        </w:rPr>
+        <w:t xml:space="preserve"> استثنا (Exclusion) تعریف کنید تا حمله اجرا شود و ببینیم قانون SIEM آن را می‌گیرد یا نه.</w:t>
+      </w:r>
+    </w:p>
+    <w:p>
+      <w:pPr>
+        <w:pStyle w:val="ListParagraph"/>
+        <w:numPr>
+          <w:ilvl w:val="0"/>
+          <w:numId w:val="2"/>
+        </w:numPr>
+        <w:bidi/>
+        <w:spacing w:after="60"/>
+      </w:pPr>
+      <w:r>
+        <w:rPr>
+          <w:rFonts w:ascii="Segoe UI" w:cs="Tahoma" w:eastAsia="Segoe UI" w:hAnsi="Segoe UI"/>
+          <w:b/>
+          <w:bCs/>
+          <w:rtl/>
+        </w:rPr>
+        <w:t xml:space="preserve">حالت واقعی:</w:t>
+      </w:r>
+      <w:r>
+        <w:rPr>
+          <w:rFonts w:ascii="Segoe UI" w:cs="Tahoma" w:eastAsia="Segoe UI" w:hAnsi="Segoe UI"/>
+          <w:rtl/>
+        </w:rPr>
+        <w:t xml:space="preserve"> Defender کامل روشن؛ نشان می‌دهد در عمل چه چیزی جلوی حمله را می‌گیرد.</w:t>
+      </w:r>
+    </w:p>
+    <w:tbl>
+      <w:tblPr>
+        <w:tblW w:type="dxa" w:w="9638"/>
+        <w:tblBorders>
+          <w:top w:val="single" w:color="auto" w:sz="4"/>
+          <w:left w:val="single" w:color="auto" w:sz="4"/>
+          <w:bottom w:val="single" w:color="auto" w:sz="4"/>
+          <w:right w:val="single" w:color="auto" w:sz="4"/>
+          <w:insideH w:val="single" w:color="auto" w:sz="4"/>
+          <w:insideV w:val="single" w:color="auto" w:sz="4"/>
+        </w:tblBorders>
+      </w:tblPr>
+      <w:tblGrid>
+        <w:gridCol w:w="9638"/>
+      </w:tblGrid>
+      <w:tr>
+        <w:tc>
+          <w:tcPr>
+            <w:tcW w:type="dxa" w:w="9638"/>
+            <w:tcBorders>
+              <w:top w:val="single" w:color="D5DCE4" w:sz="4"/>
+              <w:left w:val="single" w:color="0B6E79" w:sz="16"/>
+              <w:bottom w:val="single" w:color="D5DCE4" w:sz="4"/>
+              <w:right w:val="single" w:color="D5DCE4" w:sz="4"/>
+            </w:tcBorders>
+            <w:shd w:fill="F3F5F8" w:color="auto" w:val="clear"/>
+            <w:tcMar>
+              <w:top w:type="dxa" w:w="100"/>
+              <w:left w:type="dxa" w:w="160"/>
+              <w:bottom w:type="dxa" w:w="100"/>
+              <w:right w:type="dxa" w:w="160"/>
+            </w:tcMar>
+          </w:tcPr>
+          <w:p>
+            <w:pPr>
+              <w:spacing w:after="0" w:line="260" w:lineRule="auto"/>
+              <w:jc w:val="left"/>
+            </w:pPr>
+            <w:r>
+              <w:rPr>
+                <w:rFonts w:ascii="Consolas" w:cs="Consolas" w:hAnsi="Consolas"/>
+                <w:color w:val="1B2533"/>
+                <w:sz w:val="17"/>
+                <w:szCs w:val="17"/>
+              </w:rPr>
+              <w:t xml:space="preserve">Add-MpPreference -ExclusionPath 'C:\AtomicRedTeam'</w:t>
+            </w:r>
+          </w:p>
+        </w:tc>
+      </w:tr>
+    </w:tbl>
+    <w:p>
+      <w:pPr>
+        <w:spacing w:after="140"/>
+      </w:pPr>
+    </w:p>
+    <w:p>
+      <w:pPr>
+        <w:pStyle w:val="Heading1"/>
+        <w:pageBreakBefore/>
+        <w:bidi/>
+      </w:pPr>
+      <w:r>
+        <w:rPr>
+          <w:rFonts w:ascii="Segoe UI" w:cs="Tahoma" w:eastAsia="Segoe UI" w:hAnsi="Segoe UI"/>
+          <w:rtl/>
+        </w:rPr>
+        <w:t xml:space="preserve">۶. DC-LAB و LNX-VICTIM (اختیاری)</w:t>
+      </w:r>
+    </w:p>
+    <w:p>
+      <w:pPr>
+        <w:pStyle w:val="Heading2"/>
+        <w:bidi/>
+      </w:pPr>
+      <w:r>
+        <w:rPr>
+          <w:rFonts w:ascii="Segoe UI" w:cs="Tahoma" w:eastAsia="Segoe UI" w:hAnsi="Segoe UI"/>
+          <w:rtl/>
+        </w:rPr>
+        <w:t xml:space="preserve">DC-LAB</w:t>
+      </w:r>
+    </w:p>
+    <w:p>
+      <w:pPr>
+        <w:bidi/>
+        <w:spacing w:after="60"/>
+        <w:ind w:right="200"/>
+      </w:pPr>
+      <w:r>
+        <w:rPr>
+          <w:rFonts w:ascii="Segoe UI" w:cs="Tahoma" w:eastAsia="Segoe UI" w:hAnsi="Segoe UI"/>
+          <w:color w:val="0B6E79"/>
+        </w:rPr>
+        <w:t xml:space="preserve">☐  </w:t>
+      </w:r>
+      <w:r>
+        <w:rPr>
+          <w:rFonts w:ascii="Segoe UI" w:cs="Tahoma" w:eastAsia="Segoe UI" w:hAnsi="Segoe UI"/>
+          <w:rtl/>
+        </w:rPr>
+        <w:t xml:space="preserve">Windows Server 2022 نصب و نقش </w:t>
+      </w:r>
+      <w:r>
+        <w:rPr>
+          <w:rFonts w:ascii="Segoe UI" w:cs="Tahoma" w:eastAsia="Segoe UI" w:hAnsi="Segoe UI"/>
+          <w:b/>
+          <w:bCs/>
+          <w:rtl w:val="false"/>
+        </w:rPr>
+        <w:t xml:space="preserve">AD DS</w:t>
+      </w:r>
+      <w:r>
+        <w:rPr>
+          <w:rFonts w:ascii="Segoe UI" w:cs="Tahoma" w:eastAsia="Segoe UI" w:hAnsi="Segoe UI"/>
+          <w:rtl/>
+        </w:rPr>
+        <w:t xml:space="preserve"> با دامنه‌ی جدا (مثلاً </w:t>
+      </w:r>
+      <w:r>
+        <w:rPr>
+          <w:rFonts w:ascii="Consolas" w:cs="Consolas" w:hAnsi="Consolas"/>
+          <w:color w:val="0B6E79"/>
+          <w:sz w:val="19"/>
+          <w:szCs w:val="19"/>
+          <w:rtl w:val="false"/>
+        </w:rPr>
+        <w:t xml:space="preserve">‎lab.local‎</w:t>
+      </w:r>
+      <w:r>
+        <w:rPr>
+          <w:rFonts w:ascii="Segoe UI" w:cs="Tahoma" w:eastAsia="Segoe UI" w:hAnsi="Segoe UI"/>
+          <w:rtl/>
+        </w:rPr>
+        <w:t xml:space="preserve">) راه‌اندازی شود — هیچ Trust با دامنه‌ی سازمان.</w:t>
+      </w:r>
+    </w:p>
+    <w:p>
+      <w:pPr>
+        <w:bidi/>
+        <w:spacing w:after="60"/>
+        <w:ind w:right="200"/>
+      </w:pPr>
+      <w:r>
+        <w:rPr>
+          <w:rFonts w:ascii="Segoe UI" w:cs="Tahoma" w:eastAsia="Segoe UI" w:hAnsi="Segoe UI"/>
+          <w:color w:val="0B6E79"/>
+        </w:rPr>
+        <w:t xml:space="preserve">☐  </w:t>
+      </w:r>
+      <w:r>
+        <w:rPr>
+          <w:rFonts w:ascii="Segoe UI" w:cs="Tahoma" w:eastAsia="Segoe UI" w:hAnsi="Segoe UI"/>
+          <w:rtl/>
+        </w:rPr>
+        <w:t xml:space="preserve">WIN-VICTIM عضو دامنه‌ی </w:t>
+      </w:r>
+      <w:r>
+        <w:rPr>
+          <w:rFonts w:ascii="Consolas" w:cs="Consolas" w:hAnsi="Consolas"/>
+          <w:color w:val="0B6E79"/>
+          <w:sz w:val="19"/>
+          <w:szCs w:val="19"/>
+          <w:rtl w:val="false"/>
+        </w:rPr>
+        <w:t xml:space="preserve">‎lab.local‎</w:t>
+      </w:r>
+      <w:r>
+        <w:rPr>
+          <w:rFonts w:ascii="Segoe UI" w:cs="Tahoma" w:eastAsia="Segoe UI" w:hAnsi="Segoe UI"/>
+          <w:rtl/>
+        </w:rPr>
+        <w:t xml:space="preserve"> شود.</w:t>
+      </w:r>
+    </w:p>
+    <w:p>
+      <w:pPr>
+        <w:bidi/>
+        <w:spacing w:after="60"/>
+        <w:ind w:right="200"/>
+      </w:pPr>
+      <w:r>
+        <w:rPr>
+          <w:rFonts w:ascii="Segoe UI" w:cs="Tahoma" w:eastAsia="Segoe UI" w:hAnsi="Segoe UI"/>
+          <w:color w:val="0B6E79"/>
+        </w:rPr>
+        <w:t xml:space="preserve">☐  </w:t>
+      </w:r>
+      <w:r>
+        <w:rPr>
+          <w:rFonts w:ascii="Segoe UI" w:cs="Tahoma" w:eastAsia="Segoe UI" w:hAnsi="Segoe UI"/>
+          <w:rtl/>
+        </w:rPr>
+        <w:t xml:space="preserve">همان مراحل فصل ۵ (Sysmon، Audit، Forwarder) روی DC هم انجام شود.</w:t>
+      </w:r>
+    </w:p>
+    <w:p>
+      <w:pPr>
+        <w:bidi/>
+        <w:spacing w:after="60"/>
+        <w:ind w:right="200"/>
+      </w:pPr>
+      <w:r>
+        <w:rPr>
+          <w:rFonts w:ascii="Segoe UI" w:cs="Tahoma" w:eastAsia="Segoe UI" w:hAnsi="Segoe UI"/>
+          <w:color w:val="0B6E79"/>
+        </w:rPr>
+        <w:t xml:space="preserve">☐  </w:t>
+      </w:r>
+      <w:r>
+        <w:rPr>
+          <w:rFonts w:ascii="Segoe UI" w:cs="Tahoma" w:eastAsia="Segoe UI" w:hAnsi="Segoe UI"/>
+          <w:rtl/>
+        </w:rPr>
+        <w:t xml:space="preserve">چند کاربر و گروه آزمایشی و یک حساب سرویس با SPN بسازید تا تست‌هایی مثل Kerberoasting معنی داشته باشند.</w:t>
+      </w:r>
+    </w:p>
+    <w:p>
+      <w:pPr>
+        <w:pStyle w:val="Heading2"/>
+        <w:bidi/>
+      </w:pPr>
+      <w:r>
+        <w:rPr>
+          <w:rFonts w:ascii="Segoe UI" w:cs="Tahoma" w:eastAsia="Segoe UI" w:hAnsi="Segoe UI"/>
+          <w:rtl/>
+        </w:rPr>
+        <w:t xml:space="preserve">LNX-VICTIM</w:t>
+      </w:r>
+    </w:p>
+    <w:p>
+      <w:pPr>
+        <w:bidi/>
+        <w:spacing w:after="60"/>
+        <w:ind w:right="200"/>
+      </w:pPr>
+      <w:r>
+        <w:rPr>
+          <w:rFonts w:ascii="Segoe UI" w:cs="Tahoma" w:eastAsia="Segoe UI" w:hAnsi="Segoe UI"/>
+          <w:color w:val="0B6E79"/>
+        </w:rPr>
+        <w:t xml:space="preserve">☐  </w:t>
+      </w:r>
+      <w:r>
+        <w:rPr>
+          <w:rFonts w:ascii="Segoe UI" w:cs="Tahoma" w:eastAsia="Segoe UI" w:hAnsi="Segoe UI"/>
+          <w:rtl/>
+        </w:rPr>
+        <w:t xml:space="preserve">نصب </w:t>
+      </w:r>
+      <w:r>
+        <w:rPr>
+          <w:rFonts w:ascii="Segoe UI" w:cs="Tahoma" w:eastAsia="Segoe UI" w:hAnsi="Segoe UI"/>
+          <w:b/>
+          <w:bCs/>
+          <w:rtl w:val="false"/>
+        </w:rPr>
+        <w:t xml:space="preserve">auditd</w:t>
+      </w:r>
+      <w:r>
+        <w:rPr>
+          <w:rFonts w:ascii="Segoe UI" w:cs="Tahoma" w:eastAsia="Segoe UI" w:hAnsi="Segoe UI"/>
+          <w:rtl/>
+        </w:rPr>
+        <w:t xml:space="preserve"> و </w:t>
+      </w:r>
+      <w:r>
+        <w:rPr>
+          <w:rFonts w:ascii="Segoe UI" w:cs="Tahoma" w:eastAsia="Segoe UI" w:hAnsi="Segoe UI"/>
+          <w:b/>
+          <w:bCs/>
+          <w:rtl w:val="false"/>
+        </w:rPr>
+        <w:t xml:space="preserve">Sysmon for Linux</w:t>
+      </w:r>
+      <w:r>
+        <w:rPr>
+          <w:rFonts w:ascii="Segoe UI" w:cs="Tahoma" w:eastAsia="Segoe UI" w:hAnsi="Segoe UI"/>
+          <w:rtl/>
+        </w:rPr>
+        <w:t xml:space="preserve"> (از مخزن بسته‌های Microsoft).</w:t>
+      </w:r>
+    </w:p>
+    <w:p>
+      <w:pPr>
+        <w:bidi/>
+        <w:spacing w:after="60"/>
+        <w:ind w:right="200"/>
+      </w:pPr>
+      <w:r>
+        <w:rPr>
+          <w:rFonts w:ascii="Segoe UI" w:cs="Tahoma" w:eastAsia="Segoe UI" w:hAnsi="Segoe UI"/>
+          <w:color w:val="0B6E79"/>
+        </w:rPr>
+        <w:t xml:space="preserve">☐  </w:t>
+      </w:r>
+      <w:r>
+        <w:rPr>
+          <w:rFonts w:ascii="Segoe UI" w:cs="Tahoma" w:eastAsia="Segoe UI" w:hAnsi="Segoe UI"/>
+          <w:rtl/>
+        </w:rPr>
+        <w:t xml:space="preserve">نصب Splunk Universal Forwarder برای لینوکس، فرستادن </w:t>
+      </w:r>
+      <w:r>
+        <w:rPr>
+          <w:rFonts w:ascii="Consolas" w:cs="Consolas" w:hAnsi="Consolas"/>
+          <w:color w:val="0B6E79"/>
+          <w:sz w:val="19"/>
+          <w:szCs w:val="19"/>
+          <w:rtl w:val="false"/>
+        </w:rPr>
+        <w:t xml:space="preserve">‎/var/log/audit/audit.log‎</w:t>
+      </w:r>
+      <w:r>
+        <w:rPr>
+          <w:rFonts w:ascii="Segoe UI" w:cs="Tahoma" w:eastAsia="Segoe UI" w:hAnsi="Segoe UI"/>
+          <w:rtl/>
+        </w:rPr>
+        <w:t xml:space="preserve">، </w:t>
+      </w:r>
+      <w:r>
+        <w:rPr>
+          <w:rFonts w:ascii="Consolas" w:cs="Consolas" w:hAnsi="Consolas"/>
+          <w:color w:val="0B6E79"/>
+          <w:sz w:val="19"/>
+          <w:szCs w:val="19"/>
+          <w:rtl w:val="false"/>
+        </w:rPr>
+        <w:t xml:space="preserve">‎/var/log/syslog‎</w:t>
+      </w:r>
+      <w:r>
+        <w:rPr>
+          <w:rFonts w:ascii="Segoe UI" w:cs="Tahoma" w:eastAsia="Segoe UI" w:hAnsi="Segoe UI"/>
+          <w:rtl/>
+        </w:rPr>
+        <w:t xml:space="preserve"> و لاگ Sysmon به index </w:t>
+      </w:r>
+      <w:r>
+        <w:rPr>
+          <w:rFonts w:ascii="Consolas" w:cs="Consolas" w:hAnsi="Consolas"/>
+          <w:color w:val="0B6E79"/>
+          <w:sz w:val="19"/>
+          <w:szCs w:val="19"/>
+          <w:rtl w:val="false"/>
+        </w:rPr>
+        <w:t xml:space="preserve">‎linux‎</w:t>
+      </w:r>
+      <w:r>
+        <w:rPr>
+          <w:rFonts w:ascii="Segoe UI" w:cs="Tahoma" w:eastAsia="Segoe UI" w:hAnsi="Segoe UI"/>
+          <w:rtl/>
+        </w:rPr>
+        <w:t xml:space="preserve">.</w:t>
+      </w:r>
+    </w:p>
+    <w:p>
+      <w:pPr>
+        <w:bidi/>
+        <w:spacing w:after="60"/>
+        <w:ind w:right="200"/>
+      </w:pPr>
+      <w:r>
+        <w:rPr>
+          <w:rFonts w:ascii="Segoe UI" w:cs="Tahoma" w:eastAsia="Segoe UI" w:hAnsi="Segoe UI"/>
+          <w:color w:val="0B6E79"/>
+        </w:rPr>
+        <w:t xml:space="preserve">☐  </w:t>
+      </w:r>
+      <w:r>
+        <w:rPr>
+          <w:rFonts w:ascii="Segoe UI" w:cs="Tahoma" w:eastAsia="Segoe UI" w:hAnsi="Segoe UI"/>
+          <w:rtl/>
+        </w:rPr>
+        <w:t xml:space="preserve">نصب </w:t>
+      </w:r>
+      <w:r>
+        <w:rPr>
+          <w:rFonts w:ascii="Segoe UI" w:cs="Tahoma" w:eastAsia="Segoe UI" w:hAnsi="Segoe UI"/>
+          <w:b/>
+          <w:bCs/>
+          <w:rtl w:val="false"/>
+        </w:rPr>
+        <w:t xml:space="preserve">PowerShell 7</w:t>
+      </w:r>
+      <w:r>
+        <w:rPr>
+          <w:rFonts w:ascii="Segoe UI" w:cs="Tahoma" w:eastAsia="Segoe UI" w:hAnsi="Segoe UI"/>
+          <w:rtl/>
+        </w:rPr>
+        <w:t xml:space="preserve"> (</w:t>
+      </w:r>
+      <w:r>
+        <w:rPr>
+          <w:rFonts w:ascii="Consolas" w:cs="Consolas" w:hAnsi="Consolas"/>
+          <w:color w:val="0B6E79"/>
+          <w:sz w:val="19"/>
+          <w:szCs w:val="19"/>
+          <w:rtl w:val="false"/>
+        </w:rPr>
+        <w:t xml:space="preserve">‎pwsh‎</w:t>
+      </w:r>
+      <w:r>
+        <w:rPr>
+          <w:rFonts w:ascii="Segoe UI" w:cs="Tahoma" w:eastAsia="Segoe UI" w:hAnsi="Segoe UI"/>
+          <w:rtl/>
+        </w:rPr>
+        <w:t xml:space="preserve">) تا Invoke-AtomicRedTeam روی لینوکس هم کار کند.</w:t>
+      </w:r>
+    </w:p>
+    <w:p>
+      <w:pPr>
+        <w:pStyle w:val="Heading1"/>
+        <w:pageBreakBefore/>
+        <w:bidi/>
+      </w:pPr>
+      <w:r>
+        <w:rPr>
+          <w:rFonts w:ascii="Segoe UI" w:cs="Tahoma" w:eastAsia="Segoe UI" w:hAnsi="Segoe UI"/>
+          <w:rtl/>
+        </w:rPr>
+        <w:t xml:space="preserve">۷. نصب Atomic Red Team و اجرای اولین تست</w:t>
+      </w:r>
+    </w:p>
+    <w:p>
+      <w:pPr>
+        <w:pStyle w:val="Heading2"/>
+        <w:bidi/>
+      </w:pPr>
+      <w:r>
+        <w:rPr>
+          <w:rFonts w:ascii="Segoe UI" w:cs="Tahoma" w:eastAsia="Segoe UI" w:hAnsi="Segoe UI"/>
+          <w:rtl/>
+        </w:rPr>
+        <w:t xml:space="preserve">۷-۱. نصب روی WIN-VICTIM</w:t>
+      </w:r>
+    </w:p>
+    <w:tbl>
+      <w:tblPr>
+        <w:tblW w:type="dxa" w:w="9638"/>
+        <w:tblBorders>
+          <w:top w:val="single" w:color="auto" w:sz="4"/>
+          <w:left w:val="single" w:color="auto" w:sz="4"/>
+          <w:bottom w:val="single" w:color="auto" w:sz="4"/>
+          <w:right w:val="single" w:color="auto" w:sz="4"/>
+          <w:insideH w:val="single" w:color="auto" w:sz="4"/>
+          <w:insideV w:val="single" w:color="auto" w:sz="4"/>
+        </w:tblBorders>
+      </w:tblPr>
+      <w:tblGrid>
+        <w:gridCol w:w="9638"/>
+      </w:tblGrid>
+      <w:tr>
+        <w:tc>
+          <w:tcPr>
+            <w:tcW w:type="dxa" w:w="9638"/>
+            <w:tcBorders>
+              <w:top w:val="single" w:color="D5DCE4" w:sz="4"/>
+              <w:left w:val="single" w:color="0B6E79" w:sz="16"/>
+              <w:bottom w:val="single" w:color="D5DCE4" w:sz="4"/>
+              <w:right w:val="single" w:color="D5DCE4" w:sz="4"/>
+            </w:tcBorders>
+            <w:shd w:fill="F3F5F8" w:color="auto" w:val="clear"/>
+            <w:tcMar>
+              <w:top w:type="dxa" w:w="100"/>
+              <w:left w:type="dxa" w:w="160"/>
+              <w:bottom w:type="dxa" w:w="100"/>
+              <w:right w:type="dxa" w:w="160"/>
+            </w:tcMar>
+          </w:tcPr>
+          <w:p>
+            <w:pPr>
+              <w:spacing w:after="0" w:line="260" w:lineRule="auto"/>
+              <w:jc w:val="left"/>
+            </w:pPr>
+            <w:r>
+              <w:rPr>
+                <w:rFonts w:ascii="Consolas" w:cs="Consolas" w:hAnsi="Consolas"/>
+                <w:color w:val="1B2533"/>
+                <w:sz w:val="17"/>
+                <w:szCs w:val="17"/>
+              </w:rPr>
+              <w:t xml:space="preserve">Set-ExecutionPolicy Bypass -Scope Process -Force</w:t>
+            </w:r>
+          </w:p>
+          <w:p>
+            <w:pPr>
+              <w:spacing w:after="0" w:line="260" w:lineRule="auto"/>
+              <w:jc w:val="left"/>
+            </w:pPr>
+            <w:r>
+              <w:rPr>
+                <w:rFonts w:ascii="Consolas" w:cs="Consolas" w:hAnsi="Consolas"/>
+                <w:color w:val="1B2533"/>
+                <w:sz w:val="17"/>
+                <w:szCs w:val="17"/>
+              </w:rPr>
+              <w:t xml:space="preserve">IEX (IWR 'https://raw.githubusercontent.com/redcanaryco/invoke-atomicredteam/master/install-atomicredteam.ps1' -UseBasicParsing)</w:t>
+            </w:r>
+          </w:p>
+          <w:p>
+            <w:pPr>
+              <w:spacing w:after="0" w:line="260" w:lineRule="auto"/>
+              <w:jc w:val="left"/>
+            </w:pPr>
+            <w:r>
+              <w:rPr>
+                <w:rFonts w:ascii="Consolas" w:cs="Consolas" w:hAnsi="Consolas"/>
+                <w:color w:val="1B2533"/>
+                <w:sz w:val="17"/>
+                <w:szCs w:val="17"/>
+              </w:rPr>
+              <w:t xml:space="preserve">Install-AtomicRedTeam -getAtomics -Force</w:t>
+            </w:r>
+          </w:p>
+        </w:tc>
+      </w:tr>
+    </w:tbl>
+    <w:p>
+      <w:pPr>
+        <w:spacing w:after="140"/>
+      </w:pPr>
+    </w:p>
+    <w:tbl>
+      <w:tblPr>
+        <w:bidiVisual/>
+        <w:tblW w:type="dxa" w:w="9638"/>
+        <w:tblBorders>
+          <w:top w:val="single" w:color="auto" w:sz="4"/>
+          <w:left w:val="single" w:color="auto" w:sz="4"/>
+          <w:bottom w:val="single" w:color="auto" w:sz="4"/>
+          <w:right w:val="single" w:color="auto" w:sz="4"/>
+          <w:insideH w:val="single" w:color="auto" w:sz="4"/>
+          <w:insideV w:val="single" w:color="auto" w:sz="4"/>
+        </w:tblBorders>
+      </w:tblPr>
+      <w:tblGrid>
+        <w:gridCol w:w="9638"/>
+      </w:tblGrid>
+      <w:tr>
+        <w:trPr>
+          <w:cantSplit/>
+        </w:trPr>
+        <w:tc>
+          <w:tcPr>
+            <w:tcW w:type="dxa" w:w="9638"/>
+            <w:tcBorders>
+              <w:top w:val="none" w:color="FFFFFF" w:sz="0"/>
+              <w:left w:val="none" w:color="FFFFFF" w:sz="0"/>
+              <w:bottom w:val="none" w:color="FFFFFF" w:sz="0"/>
+              <w:right w:val="single" w:color="0B6E79" w:sz="24"/>
+            </w:tcBorders>
+            <w:shd w:fill="E6F2F3" w:color="auto" w:val="clear"/>
+            <w:tcMar>
+              <w:top w:type="dxa" w:w="120"/>
+              <w:left w:type="dxa" w:w="200"/>
+              <w:bottom w:type="dxa" w:w="80"/>
+              <w:right w:type="dxa" w:w="200"/>
+            </w:tcMar>
+          </w:tcPr>
+          <w:p>
+            <w:pPr>
+              <w:bidi/>
+              <w:spacing w:after="60"/>
+            </w:pPr>
+            <w:r>
+              <w:rPr>
+                <w:rFonts w:ascii="Segoe UI" w:cs="Tahoma" w:eastAsia="Segoe UI" w:hAnsi="Segoe UI"/>
+                <w:b/>
+                <w:bCs/>
+                <w:color w:val="0B6E79"/>
+                <w:rtl/>
+              </w:rPr>
+              <w:t xml:space="preserve">بدون اینترنت</w:t>
+            </w:r>
+          </w:p>
+          <w:p>
+            <w:pPr>
+              <w:bidi/>
+              <w:spacing w:after="60"/>
+              <w:jc w:val="both"/>
+            </w:pPr>
+            <w:r>
+              <w:rPr>
+                <w:rFonts w:ascii="Segoe UI" w:cs="Tahoma" w:eastAsia="Segoe UI" w:hAnsi="Segoe UI"/>
+                <w:rtl/>
+              </w:rPr>
+              <w:t xml:space="preserve">اگر ماشین اینترنت ندارد: دو مخزن </w:t>
+            </w:r>
+            <w:r>
+              <w:rPr>
+                <w:rFonts w:ascii="Consolas" w:cs="Consolas" w:hAnsi="Consolas"/>
+                <w:color w:val="0B6E79"/>
+                <w:sz w:val="19"/>
+                <w:szCs w:val="19"/>
+                <w:rtl w:val="false"/>
+              </w:rPr>
+              <w:t xml:space="preserve">‎redcanaryco/invoke-atomicredteam‎</w:t>
+            </w:r>
+            <w:r>
+              <w:rPr>
+                <w:rFonts w:ascii="Segoe UI" w:cs="Tahoma" w:eastAsia="Segoe UI" w:hAnsi="Segoe UI"/>
+                <w:rtl/>
+              </w:rPr>
+              <w:t xml:space="preserve"> و </w:t>
+            </w:r>
+            <w:r>
+              <w:rPr>
+                <w:rFonts w:ascii="Consolas" w:cs="Consolas" w:hAnsi="Consolas"/>
+                <w:color w:val="0B6E79"/>
+                <w:sz w:val="19"/>
+                <w:szCs w:val="19"/>
+                <w:rtl w:val="false"/>
+              </w:rPr>
+              <w:t xml:space="preserve">‎redcanaryco/atomic-red-team‎</w:t>
+            </w:r>
+            <w:r>
+              <w:rPr>
+                <w:rFonts w:ascii="Segoe UI" w:cs="Tahoma" w:eastAsia="Segoe UI" w:hAnsi="Segoe UI"/>
+                <w:rtl/>
+              </w:rPr>
+              <w:t xml:space="preserve"> را جای دیگری به‌صورت ZIP دانلود کنید، در </w:t>
+            </w:r>
+            <w:r>
+              <w:rPr>
+                <w:rFonts w:ascii="Consolas" w:cs="Consolas" w:hAnsi="Consolas"/>
+                <w:color w:val="0B6E79"/>
+                <w:sz w:val="19"/>
+                <w:szCs w:val="19"/>
+                <w:rtl w:val="false"/>
+              </w:rPr>
+              <w:t xml:space="preserve">‎C:\AtomicRedTeam‎</w:t>
+            </w:r>
+            <w:r>
+              <w:rPr>
+                <w:rFonts w:ascii="Segoe UI" w:cs="Tahoma" w:eastAsia="Segoe UI" w:hAnsi="Segoe UI"/>
+                <w:rtl/>
+              </w:rPr>
+              <w:t xml:space="preserve"> باز کنید و ماژول </w:t>
+            </w:r>
+            <w:r>
+              <w:rPr>
+                <w:rFonts w:ascii="Consolas" w:cs="Consolas" w:hAnsi="Consolas"/>
+                <w:color w:val="0B6E79"/>
+                <w:sz w:val="19"/>
+                <w:szCs w:val="19"/>
+                <w:rtl w:val="false"/>
+              </w:rPr>
+              <w:t xml:space="preserve">‎powershell-yaml‎</w:t>
+            </w:r>
+            <w:r>
+              <w:rPr>
+                <w:rFonts w:ascii="Segoe UI" w:cs="Tahoma" w:eastAsia="Segoe UI" w:hAnsi="Segoe UI"/>
+                <w:rtl/>
+              </w:rPr>
+              <w:t xml:space="preserve"> را هم نصب کنید.</w:t>
+            </w:r>
+          </w:p>
+        </w:tc>
+      </w:tr>
+    </w:tbl>
+    <w:p>
+      <w:pPr>
+        <w:spacing w:after="120"/>
+      </w:pPr>
+    </w:p>
+    <w:p>
+      <w:pPr>
+        <w:pStyle w:val="Heading2"/>
+        <w:bidi/>
+      </w:pPr>
+      <w:r>
+        <w:rPr>
+          <w:rFonts w:ascii="Segoe UI" w:cs="Tahoma" w:eastAsia="Segoe UI" w:hAnsi="Segoe UI"/>
+          <w:rtl/>
+        </w:rPr>
+        <w:t xml:space="preserve">۷-۲. اجرای یک تست</w:t>
+      </w:r>
+    </w:p>
+    <w:p>
+      <w:pPr>
+        <w:bidi/>
+        <w:spacing w:after="120"/>
+        <w:jc w:val="both"/>
+      </w:pPr>
+      <w:r>
+        <w:rPr>
+          <w:rFonts w:ascii="Segoe UI" w:cs="Tahoma" w:eastAsia="Segoe UI" w:hAnsi="Segoe UI"/>
+          <w:rtl/>
+        </w:rPr>
+        <w:t xml:space="preserve">در DetectKB، صفحه‌ی </w:t>
+      </w:r>
+      <w:r>
+        <w:rPr>
+          <w:rFonts w:ascii="Segoe UI" w:cs="Tahoma" w:eastAsia="Segoe UI" w:hAnsi="Segoe UI"/>
+          <w:b/>
+          <w:bCs/>
+          <w:rtl w:val="false"/>
+        </w:rPr>
+        <w:t xml:space="preserve">Atomic Red Team</w:t>
+      </w:r>
+      <w:r>
+        <w:rPr>
+          <w:rFonts w:ascii="Segoe UI" w:cs="Tahoma" w:eastAsia="Segoe UI" w:hAnsi="Segoe UI"/>
+          <w:rtl/>
+        </w:rPr>
+        <w:t xml:space="preserve"> یا بخش </w:t>
+      </w:r>
+      <w:r>
+        <w:rPr>
+          <w:rFonts w:ascii="Segoe UI" w:cs="Tahoma" w:eastAsia="Segoe UI" w:hAnsi="Segoe UI"/>
+          <w:b/>
+          <w:bCs/>
+          <w:rtl w:val="false"/>
+        </w:rPr>
+        <w:t xml:space="preserve">Lab validation · Atomic Red Team</w:t>
+      </w:r>
+      <w:r>
+        <w:rPr>
+          <w:rFonts w:ascii="Segoe UI" w:cs="Tahoma" w:eastAsia="Segoe UI" w:hAnsi="Segoe UI"/>
+          <w:rtl/>
+        </w:rPr>
+        <w:t xml:space="preserve"> صفحه‌ی قانون را باز کنید و خط </w:t>
+      </w:r>
+      <w:r>
+        <w:rPr>
+          <w:rFonts w:ascii="Consolas" w:cs="Consolas" w:hAnsi="Consolas"/>
+          <w:color w:val="0B6E79"/>
+          <w:sz w:val="19"/>
+          <w:szCs w:val="19"/>
+          <w:rtl w:val="false"/>
+        </w:rPr>
+        <w:t xml:space="preserve">‎Invoke-AtomicTest‎</w:t>
+      </w:r>
+      <w:r>
+        <w:rPr>
+          <w:rFonts w:ascii="Segoe UI" w:cs="Tahoma" w:eastAsia="Segoe UI" w:hAnsi="Segoe UI"/>
+          <w:rtl/>
+        </w:rPr>
+        <w:t xml:space="preserve"> را کپی کنید. روی WIN-VICTIM:</w:t>
+      </w:r>
+    </w:p>
+    <w:tbl>
+      <w:tblPr>
+        <w:tblW w:type="dxa" w:w="9638"/>
+        <w:tblBorders>
+          <w:top w:val="single" w:color="auto" w:sz="4"/>
+          <w:left w:val="single" w:color="auto" w:sz="4"/>
+          <w:bottom w:val="single" w:color="auto" w:sz="4"/>
+          <w:right w:val="single" w:color="auto" w:sz="4"/>
+          <w:insideH w:val="single" w:color="auto" w:sz="4"/>
+          <w:insideV w:val="single" w:color="auto" w:sz="4"/>
+        </w:tblBorders>
+      </w:tblPr>
+      <w:tblGrid>
+        <w:gridCol w:w="9638"/>
+      </w:tblGrid>
+      <w:tr>
+        <w:tc>
+          <w:tcPr>
+            <w:tcW w:type="dxa" w:w="9638"/>
+            <w:tcBorders>
+              <w:top w:val="single" w:color="D5DCE4" w:sz="4"/>
+              <w:left w:val="single" w:color="0B6E79" w:sz="16"/>
+              <w:bottom w:val="single" w:color="D5DCE4" w:sz="4"/>
+              <w:right w:val="single" w:color="D5DCE4" w:sz="4"/>
+            </w:tcBorders>
+            <w:shd w:fill="F3F5F8" w:color="auto" w:val="clear"/>
+            <w:tcMar>
+              <w:top w:type="dxa" w:w="100"/>
+              <w:left w:type="dxa" w:w="160"/>
+              <w:bottom w:type="dxa" w:w="100"/>
+              <w:right w:type="dxa" w:w="160"/>
+            </w:tcMar>
+          </w:tcPr>
+          <w:p>
+            <w:pPr>
+              <w:spacing w:after="0" w:line="260" w:lineRule="auto"/>
+              <w:jc w:val="left"/>
+            </w:pPr>
+            <w:r>
+              <w:rPr>
+                <w:rFonts w:ascii="Consolas" w:cs="Consolas" w:hAnsi="Consolas"/>
+                <w:color w:val="1B2533"/>
+                <w:sz w:val="17"/>
+                <w:szCs w:val="17"/>
+              </w:rPr>
+              <w:t xml:space="preserve">Import-Module 'C:\AtomicRedTeam\invoke-atomicredteam\Invoke-AtomicRedTeam.psd1' -Force</w:t>
+            </w:r>
+          </w:p>
+          <w:p>
+            <w:pPr>
+              <w:spacing w:after="0" w:line="260" w:lineRule="auto"/>
+              <w:jc w:val="left"/>
+            </w:pPr>
+            <w:r>
+              <w:rPr>
+                <w:rFonts w:ascii="Consolas" w:cs="Consolas" w:hAnsi="Consolas"/>
+                <w:color w:val="1B2533"/>
+                <w:sz w:val="17"/>
+                <w:szCs w:val="17"/>
+              </w:rPr>
+              <w:t xml:space="preserve"> </w:t>
+            </w:r>
+          </w:p>
+          <w:p>
+            <w:pPr>
+              <w:spacing w:after="0" w:line="260" w:lineRule="auto"/>
+              <w:jc w:val="left"/>
+            </w:pPr>
+            <w:r>
+              <w:rPr>
+                <w:rFonts w:ascii="Consolas" w:cs="Consolas" w:hAnsi="Consolas"/>
+                <w:color w:val="1B2533"/>
+                <w:sz w:val="17"/>
+                <w:szCs w:val="17"/>
+              </w:rPr>
+              <w:t xml:space="preserve"># 1. Prerequisites (downloads the test's tools)</w:t>
+            </w:r>
+          </w:p>
+          <w:p>
+            <w:pPr>
+              <w:spacing w:after="0" w:line="260" w:lineRule="auto"/>
+              <w:jc w:val="left"/>
+            </w:pPr>
+            <w:r>
+              <w:rPr>
+                <w:rFonts w:ascii="Consolas" w:cs="Consolas" w:hAnsi="Consolas"/>
+                <w:color w:val="1B2533"/>
+                <w:sz w:val="17"/>
+                <w:szCs w:val="17"/>
+              </w:rPr>
+              <w:t xml:space="preserve">Invoke-AtomicTest T1003.001 -TestGuids 2536dee2-12fb-459a-8c37-971844fa73be -GetPrereqs</w:t>
+            </w:r>
+          </w:p>
+          <w:p>
+            <w:pPr>
+              <w:spacing w:after="0" w:line="260" w:lineRule="auto"/>
+              <w:jc w:val="left"/>
+            </w:pPr>
+            <w:r>
+              <w:rPr>
+                <w:rFonts w:ascii="Consolas" w:cs="Consolas" w:hAnsi="Consolas"/>
+                <w:color w:val="1B2533"/>
+                <w:sz w:val="17"/>
+                <w:szCs w:val="17"/>
+              </w:rPr>
+              <w:t xml:space="preserve"> </w:t>
+            </w:r>
+          </w:p>
+          <w:p>
+            <w:pPr>
+              <w:spacing w:after="0" w:line="260" w:lineRule="auto"/>
+              <w:jc w:val="left"/>
+            </w:pPr>
+            <w:r>
+              <w:rPr>
+                <w:rFonts w:ascii="Consolas" w:cs="Consolas" w:hAnsi="Consolas"/>
+                <w:color w:val="1B2533"/>
+                <w:sz w:val="17"/>
+                <w:szCs w:val="17"/>
+              </w:rPr>
+              <w:t xml:space="preserve"># 2. Run the attack</w:t>
+            </w:r>
+          </w:p>
+          <w:p>
+            <w:pPr>
+              <w:spacing w:after="0" w:line="260" w:lineRule="auto"/>
+              <w:jc w:val="left"/>
+            </w:pPr>
+            <w:r>
+              <w:rPr>
+                <w:rFonts w:ascii="Consolas" w:cs="Consolas" w:hAnsi="Consolas"/>
+                <w:color w:val="1B2533"/>
+                <w:sz w:val="17"/>
+                <w:szCs w:val="17"/>
+              </w:rPr>
+              <w:t xml:space="preserve">Invoke-AtomicTest T1003.001 -TestGuids 2536dee2-12fb-459a-8c37-971844fa73be</w:t>
+            </w:r>
+          </w:p>
+          <w:p>
+            <w:pPr>
+              <w:spacing w:after="0" w:line="260" w:lineRule="auto"/>
+              <w:jc w:val="left"/>
+            </w:pPr>
+            <w:r>
+              <w:rPr>
+                <w:rFonts w:ascii="Consolas" w:cs="Consolas" w:hAnsi="Consolas"/>
+                <w:color w:val="1B2533"/>
+                <w:sz w:val="17"/>
+                <w:szCs w:val="17"/>
+              </w:rPr>
+              <w:t xml:space="preserve"> </w:t>
+            </w:r>
+          </w:p>
+          <w:p>
+            <w:pPr>
+              <w:spacing w:after="0" w:line="260" w:lineRule="auto"/>
+              <w:jc w:val="left"/>
+            </w:pPr>
+            <w:r>
+              <w:rPr>
+                <w:rFonts w:ascii="Consolas" w:cs="Consolas" w:hAnsi="Consolas"/>
+                <w:color w:val="1B2533"/>
+                <w:sz w:val="17"/>
+                <w:szCs w:val="17"/>
+              </w:rPr>
+              <w:t xml:space="preserve"># 3. Clean up</w:t>
+            </w:r>
+          </w:p>
+          <w:p>
+            <w:pPr>
+              <w:spacing w:after="0" w:line="260" w:lineRule="auto"/>
+              <w:jc w:val="left"/>
+            </w:pPr>
+            <w:r>
+              <w:rPr>
+                <w:rFonts w:ascii="Consolas" w:cs="Consolas" w:hAnsi="Consolas"/>
+                <w:color w:val="1B2533"/>
+                <w:sz w:val="17"/>
+                <w:szCs w:val="17"/>
+              </w:rPr>
+              <w:t xml:space="preserve">Invoke-AtomicTest T1003.001 -TestGuids 2536dee2-12fb-459a-8c37-971844fa73be -Cleanup</w:t>
+            </w:r>
+          </w:p>
+        </w:tc>
+      </w:tr>
+    </w:tbl>
+    <w:p>
+      <w:pPr>
+        <w:spacing w:after="140"/>
+      </w:pPr>
+    </w:p>
+    <w:p>
+      <w:pPr>
+        <w:pStyle w:val="Heading2"/>
+        <w:bidi/>
+      </w:pPr>
+      <w:r>
+        <w:rPr>
+          <w:rFonts w:ascii="Segoe UI" w:cs="Tahoma" w:eastAsia="Segoe UI" w:hAnsi="Segoe UI"/>
+          <w:rtl/>
+        </w:rPr>
+        <w:t xml:space="preserve">۷-۳. دیدن نتیجه و ثبت آن در DetectKB</w:t>
       </w:r>
     </w:p>
     <w:p>
@@ -7936,7 +8204,7 @@
           <w:rFonts w:ascii="Segoe UI" w:cs="Tahoma" w:eastAsia="Segoe UI" w:hAnsi="Segoe UI"/>
           <w:rtl/>
         </w:rPr>
-        <w:t xml:space="preserve">۲ تا ۵ دقیقه صبر کنید تا لاگ‌ها به Splunk برسند.</w:t>
+        <w:t xml:space="preserve">۵ تا ۱۰ دقیقه صبر کنید تا لاگ‌ها به Splunk برسند و جستجوهای ذخیره‌شده اجرا شوند.</w:t>
       </w:r>
     </w:p>
     <w:p>
@@ -7954,13 +8222,29 @@
           <w:rFonts w:ascii="Segoe UI" w:cs="Tahoma" w:eastAsia="Segoe UI" w:hAnsi="Segoe UI"/>
           <w:rtl/>
         </w:rPr>
-        <w:t xml:space="preserve">در Splunk، کوئری قانون (از صفحه‌ی قانون در DetectKB) را برای </w:t>
+        <w:t xml:space="preserve">در Splunk، </w:t>
       </w:r>
       <w:r>
         <w:rPr>
           <w:rFonts w:ascii="Segoe UI" w:cs="Tahoma" w:eastAsia="Segoe UI" w:hAnsi="Segoe UI"/>
           <w:b/>
           <w:bCs/>
+          <w:rtl w:val="false"/>
+        </w:rPr>
+        <w:t xml:space="preserve">Activity → Triggered Alerts</w:t>
+      </w:r>
+      <w:r>
+        <w:rPr>
+          <w:rFonts w:ascii="Segoe UI" w:cs="Tahoma" w:eastAsia="Segoe UI" w:hAnsi="Segoe UI"/>
+          <w:rtl/>
+        </w:rPr>
+        <w:t xml:space="preserve"> را ببینید، یا کوئری قانون را برای </w:t>
+      </w:r>
+      <w:r>
+        <w:rPr>
+          <w:rFonts w:ascii="Segoe UI" w:cs="Tahoma" w:eastAsia="Segoe UI" w:hAnsi="Segoe UI"/>
+          <w:b/>
+          <w:bCs/>
           <w:rtl/>
         </w:rPr>
         <w:t xml:space="preserve">۱۵ دقیقه‌ی اخیر</w:t>
@@ -7970,7 +8254,7 @@
           <w:rFonts w:ascii="Segoe UI" w:cs="Tahoma" w:eastAsia="Segoe UI" w:hAnsi="Segoe UI"/>
           <w:rtl/>
         </w:rPr>
-        <w:t xml:space="preserve"> اجرا کنید.</w:t>
+        <w:t xml:space="preserve"> دستی اجرا کنید.</w:t>
       </w:r>
     </w:p>
     <w:p>
@@ -7988,7 +8272,87 @@
           <w:rFonts w:ascii="Segoe UI" w:cs="Tahoma" w:eastAsia="Segoe UI" w:hAnsi="Segoe UI"/>
           <w:rtl/>
         </w:rPr>
-        <w:t xml:space="preserve">نتیجه داشت ← قانون کار می‌کند ✅ · نتیجه نداشت ← قانون یا لاگ مشکل دارد ❌</w:t>
+        <w:t xml:space="preserve">در DetectKB، در جزئیات همان تست </w:t>
+      </w:r>
+      <w:r>
+        <w:rPr>
+          <w:rFonts w:ascii="Segoe UI" w:cs="Tahoma" w:eastAsia="Segoe UI" w:hAnsi="Segoe UI"/>
+          <w:b/>
+          <w:bCs/>
+          <w:rtl w:val="false"/>
+        </w:rPr>
+        <w:t xml:space="preserve">Record a run</w:t>
+      </w:r>
+      <w:r>
+        <w:rPr>
+          <w:rFonts w:ascii="Segoe UI" w:cs="Tahoma" w:eastAsia="Segoe UI" w:hAnsi="Segoe UI"/>
+          <w:rtl/>
+        </w:rPr>
+        <w:t xml:space="preserve"> را بزنید و برای هر قانون نتیجه را ثبت کنید: </w:t>
+      </w:r>
+      <w:r>
+        <w:rPr>
+          <w:rFonts w:ascii="Segoe UI" w:cs="Tahoma" w:eastAsia="Segoe UI" w:hAnsi="Segoe UI"/>
+          <w:b/>
+          <w:bCs/>
+          <w:rtl w:val="false"/>
+        </w:rPr>
+        <w:t xml:space="preserve">Detected</w:t>
+      </w:r>
+      <w:r>
+        <w:rPr>
+          <w:rFonts w:ascii="Segoe UI" w:cs="Tahoma" w:eastAsia="Segoe UI" w:hAnsi="Segoe UI"/>
+          <w:rtl/>
+        </w:rPr>
+        <w:t xml:space="preserve">، </w:t>
+      </w:r>
+      <w:r>
+        <w:rPr>
+          <w:rFonts w:ascii="Segoe UI" w:cs="Tahoma" w:eastAsia="Segoe UI" w:hAnsi="Segoe UI"/>
+          <w:b/>
+          <w:bCs/>
+          <w:rtl w:val="false"/>
+        </w:rPr>
+        <w:t xml:space="preserve">Not detected</w:t>
+      </w:r>
+      <w:r>
+        <w:rPr>
+          <w:rFonts w:ascii="Segoe UI" w:cs="Tahoma" w:eastAsia="Segoe UI" w:hAnsi="Segoe UI"/>
+          <w:rtl/>
+        </w:rPr>
+        <w:t xml:space="preserve">، یا اگر حمله اجرا نشد </w:t>
+      </w:r>
+      <w:r>
+        <w:rPr>
+          <w:rFonts w:ascii="Segoe UI" w:cs="Tahoma" w:eastAsia="Segoe UI" w:hAnsi="Segoe UI"/>
+          <w:b/>
+          <w:bCs/>
+          <w:rtl w:val="false"/>
+        </w:rPr>
+        <w:t xml:space="preserve">Blocked</w:t>
+      </w:r>
+      <w:r>
+        <w:rPr>
+          <w:rFonts w:ascii="Segoe UI" w:cs="Tahoma" w:eastAsia="Segoe UI" w:hAnsi="Segoe UI"/>
+          <w:rtl/>
+        </w:rPr>
+        <w:t xml:space="preserve"> / </w:t>
+      </w:r>
+      <w:r>
+        <w:rPr>
+          <w:rFonts w:ascii="Segoe UI" w:cs="Tahoma" w:eastAsia="Segoe UI" w:hAnsi="Segoe UI"/>
+          <w:b/>
+          <w:bCs/>
+          <w:rtl w:val="false"/>
+        </w:rPr>
+        <w:t xml:space="preserve">Test error</w:t>
+      </w:r>
+      <w:r>
+        <w:rPr>
+          <w:rFonts w:ascii="Segoe UI" w:cs="Tahoma" w:eastAsia="Segoe UI" w:hAnsi="Segoe UI"/>
+          <w:rtl/>
+        </w:rPr>
+        <w:t xml:space="preserve">.</w:t>
       </w:r>
     </w:p>
     <w:p>
@@ -8025,6 +8389,127 @@
         </w:rPr>
         <w:t xml:space="preserve"> برگردانید.</w:t>
       </w:r>
+    </w:p>
+    <w:p>
+      <w:pPr>
+        <w:bidi/>
+        <w:spacing w:after="120"/>
+        <w:jc w:val="both"/>
+      </w:pPr>
+      <w:r>
+        <w:rPr>
+          <w:rFonts w:ascii="Segoe UI" w:cs="Tahoma" w:eastAsia="Segoe UI" w:hAnsi="Segoe UI"/>
+          <w:rtl/>
+        </w:rPr>
+        <w:t xml:space="preserve">قانون‌هایی که هشدار دادند در DetectKB وضعیت </w:t>
+      </w:r>
+      <w:r>
+        <w:rPr>
+          <w:rFonts w:ascii="Segoe UI" w:cs="Tahoma" w:eastAsia="Segoe UI" w:hAnsi="Segoe UI"/>
+          <w:b/>
+          <w:bCs/>
+          <w:rtl w:val="false"/>
+        </w:rPr>
+        <w:t xml:space="preserve">Validated</w:t>
+      </w:r>
+      <w:r>
+        <w:rPr>
+          <w:rFonts w:ascii="Segoe UI" w:cs="Tahoma" w:eastAsia="Segoe UI" w:hAnsi="Segoe UI"/>
+          <w:rtl/>
+        </w:rPr>
+        <w:t xml:space="preserve"> می‌گیرند و در ماتریس ATT&amp;CK با گزینه‌ی </w:t>
+      </w:r>
+      <w:r>
+        <w:rPr>
+          <w:rFonts w:ascii="Segoe UI" w:cs="Tahoma" w:eastAsia="Segoe UI" w:hAnsi="Segoe UI"/>
+          <w:b/>
+          <w:bCs/>
+          <w:rtl w:val="false"/>
+        </w:rPr>
+        <w:t xml:space="preserve">Proven in lab only</w:t>
+      </w:r>
+      <w:r>
+        <w:rPr>
+          <w:rFonts w:ascii="Segoe UI" w:cs="Tahoma" w:eastAsia="Segoe UI" w:hAnsi="Segoe UI"/>
+          <w:rtl/>
+        </w:rPr>
+        <w:t xml:space="preserve"> به‌عنوان پوشش اثبات‌شده دیده می‌شوند.</w:t>
+      </w:r>
+    </w:p>
+    <w:tbl>
+      <w:tblPr>
+        <w:bidiVisual/>
+        <w:tblW w:type="dxa" w:w="9638"/>
+        <w:tblBorders>
+          <w:top w:val="single" w:color="auto" w:sz="4"/>
+          <w:left w:val="single" w:color="auto" w:sz="4"/>
+          <w:bottom w:val="single" w:color="auto" w:sz="4"/>
+          <w:right w:val="single" w:color="auto" w:sz="4"/>
+          <w:insideH w:val="single" w:color="auto" w:sz="4"/>
+          <w:insideV w:val="single" w:color="auto" w:sz="4"/>
+        </w:tblBorders>
+      </w:tblPr>
+      <w:tblGrid>
+        <w:gridCol w:w="9638"/>
+      </w:tblGrid>
+      <w:tr>
+        <w:trPr>
+          <w:cantSplit/>
+        </w:trPr>
+        <w:tc>
+          <w:tcPr>
+            <w:tcW w:type="dxa" w:w="9638"/>
+            <w:tcBorders>
+              <w:top w:val="none" w:color="FFFFFF" w:sz="0"/>
+              <w:left w:val="none" w:color="FFFFFF" w:sz="0"/>
+              <w:bottom w:val="none" w:color="FFFFFF" w:sz="0"/>
+              <w:right w:val="single" w:color="A2520C" w:sz="24"/>
+            </w:tcBorders>
+            <w:shd w:fill="FBEFE3" w:color="auto" w:val="clear"/>
+            <w:tcMar>
+              <w:top w:type="dxa" w:w="120"/>
+              <w:left w:type="dxa" w:w="200"/>
+              <w:bottom w:type="dxa" w:w="80"/>
+              <w:right w:type="dxa" w:w="200"/>
+            </w:tcMar>
+          </w:tcPr>
+          <w:p>
+            <w:pPr>
+              <w:bidi/>
+              <w:spacing w:after="60"/>
+            </w:pPr>
+            <w:r>
+              <w:rPr>
+                <w:rFonts w:ascii="Segoe UI" w:cs="Tahoma" w:eastAsia="Segoe UI" w:hAnsi="Segoe UI"/>
+                <w:b/>
+                <w:bCs/>
+                <w:color w:val="A2520C"/>
+                <w:rtl/>
+              </w:rPr>
+              <w:t xml:space="preserve">قبل از اصلاح قانون</w:t>
+            </w:r>
+          </w:p>
+          <w:p>
+            <w:pPr>
+              <w:bidi/>
+              <w:spacing w:after="60"/>
+              <w:jc w:val="both"/>
+            </w:pPr>
+            <w:r>
+              <w:rPr>
+                <w:rFonts w:ascii="Segoe UI" w:cs="Tahoma" w:eastAsia="Segoe UI" w:hAnsi="Segoe UI"/>
+                <w:rtl/>
+              </w:rPr>
+              <w:t xml:space="preserve">اگر قانونی هشدار نداد، قبل از اصلاح آن بررسی کنید حمله واقعاً اجرا شده و لاگش به Splunk رسیده است (فصل ۸). فقط وقتی لاگ هست ولی قانون آن را نمی‌گیرد، قانون نیاز به بازبینی دارد.</w:t>
+            </w:r>
+          </w:p>
+        </w:tc>
+      </w:tr>
+    </w:tbl>
+    <w:p>
+      <w:pPr>
+        <w:spacing w:after="120"/>
+      </w:pPr>
     </w:p>
     <w:p>
       <w:pPr>
@@ -9251,7 +9736,39 @@
           <w:rFonts w:ascii="Segoe UI" w:cs="Tahoma" w:eastAsia="Segoe UI" w:hAnsi="Segoe UI"/>
           <w:rtl/>
         </w:rPr>
-        <w:t xml:space="preserve">هیچ اتصالی لازم نیست. تست را طبق فصل ۷ دستی اجرا می‌کنید، نتیجه را در Splunk می‌بینید و در DetectKB ثبت می‌کنید.</w:t>
+        <w:t xml:space="preserve">هیچ اتصالی لازم نیست و این حالت همین الان در DetectKB آماده است: قانون‌ها را با </w:t>
+      </w:r>
+      <w:r>
+        <w:rPr>
+          <w:rFonts w:ascii="Segoe UI" w:cs="Tahoma" w:eastAsia="Segoe UI" w:hAnsi="Segoe UI"/>
+          <w:b/>
+          <w:bCs/>
+          <w:rtl w:val="false"/>
+        </w:rPr>
+        <w:t xml:space="preserve">Export rules for Splunk</w:t>
+      </w:r>
+      <w:r>
+        <w:rPr>
+          <w:rFonts w:ascii="Segoe UI" w:cs="Tahoma" w:eastAsia="Segoe UI" w:hAnsi="Segoe UI"/>
+          <w:rtl/>
+        </w:rPr>
+        <w:t xml:space="preserve"> به Splunk لب می‌برید (بخش ۴-۵)، تست را طبق فصل ۷ دستی اجرا می‌کنید، نتیجه را در Splunk می‌بینید و با </w:t>
+      </w:r>
+      <w:r>
+        <w:rPr>
+          <w:rFonts w:ascii="Segoe UI" w:cs="Tahoma" w:eastAsia="Segoe UI" w:hAnsi="Segoe UI"/>
+          <w:b/>
+          <w:bCs/>
+          <w:rtl w:val="false"/>
+        </w:rPr>
+        <w:t xml:space="preserve">Record a run</w:t>
+      </w:r>
+      <w:r>
+        <w:rPr>
+          <w:rFonts w:ascii="Segoe UI" w:cs="Tahoma" w:eastAsia="Segoe UI" w:hAnsi="Segoe UI"/>
+          <w:rtl/>
+        </w:rPr>
+        <w:t xml:space="preserve"> در DetectKB ثبت می‌کنید.</w:t>
       </w:r>
     </w:p>
     <w:p>
@@ -10216,7 +10733,28 @@
           <w:rFonts w:ascii="Segoe UI" w:cs="Tahoma" w:eastAsia="Segoe UI" w:hAnsi="Segoe UI"/>
           <w:rtl/>
         </w:rPr>
-        <w:t xml:space="preserve">یک تست نمونه (T1003.001) اجرا و در Splunk دیده شده است.</w:t>
+        <w:t xml:space="preserve">قانون‌ها از DetectKB خروجی گرفته و در Splunk لب بارگذاری شده‌اند (بخش ۴-۵).</w:t>
+      </w:r>
+    </w:p>
+    <w:p>
+      <w:pPr>
+        <w:bidi/>
+        <w:spacing w:after="60"/>
+        <w:ind w:right="200"/>
+      </w:pPr>
+      <w:r>
+        <w:rPr>
+          <w:rFonts w:ascii="Segoe UI" w:cs="Tahoma" w:eastAsia="Segoe UI" w:hAnsi="Segoe UI"/>
+          <w:color w:val="0B6E79"/>
+        </w:rPr>
+        <w:t xml:space="preserve">☐  </w:t>
+      </w:r>
+      <w:r>
+        <w:rPr>
+          <w:rFonts w:ascii="Segoe UI" w:cs="Tahoma" w:eastAsia="Segoe UI" w:hAnsi="Segoe UI"/>
+          <w:rtl/>
+        </w:rPr>
+        <w:t xml:space="preserve">یک تست نمونه (T1003.001) اجرا، در Splunk دیده و نتیجه‌اش در DetectKB ثبت شده است.</w:t>
       </w:r>
     </w:p>
     <w:p>

</xml_diff>